<commit_message>
W6 Lec Oct 5 updated
</commit_message>
<xml_diff>
--- a/lectures/week06/Week6_Lecture.docx
+++ b/lectures/week06/Week6_Lecture.docx
@@ -35,6 +35,7 @@
     </w:p>
     <w:p>
       <w:pPr>
+        <w:keepNext/>
         <w:spacing w:after="60" w:before="180" w:line="276"/>
         <w:jc w:val="center"/>
       </w:pPr>
@@ -84,6 +85,7 @@
     </w:p>
     <w:p>
       <w:pPr>
+        <w:keepNext/>
         <w:spacing w:after="160" w:before="340"/>
       </w:pPr>
       <w:r>
@@ -124,16 +126,7 @@
           <w:sz w:val="22"/>
           <w:szCs w:val="22"/>
         </w:rPr>
-        <w:t xml:space="preserve">1.  </w:t>
-      </w:r>
-      <w:r>
-        <w:rPr>
-          <w:rFonts w:ascii="Cambria" w:cs="Cambria" w:eastAsia="Cambria" w:hAnsi="Cambria"/>
-          <w:color w:val="333333"/>
-          <w:sz w:val="22"/>
-          <w:szCs w:val="22"/>
-        </w:rPr>
-        <w:t xml:space="preserve">Run the inverse dynamics pipeline: convert a desired hand path into the joint torques that produce it, using inverse kinematics, numerical differentiation, and the equations of motion from Week 3.</w:t>
+        <w:t xml:space="preserve">1.  Run the inverse dynamics pipeline: convert a desired hand path into the joint torques that produce it, using inverse kinematics, numerical differentiation, and the equations of motion from Week 3.</w:t>
       </w:r>
     </w:p>
     <w:p>
@@ -148,16 +141,7 @@
           <w:sz w:val="22"/>
           <w:szCs w:val="22"/>
         </w:rPr>
-        <w:t xml:space="preserve">2.  </w:t>
-      </w:r>
-      <w:r>
-        <w:rPr>
-          <w:rFonts w:ascii="Cambria" w:cs="Cambria" w:eastAsia="Cambria" w:hAnsi="Cambria"/>
-          <w:color w:val="333333"/>
-          <w:sz w:val="22"/>
-          <w:szCs w:val="22"/>
-        </w:rPr>
-        <w:t xml:space="preserve">Explain why the same 8 cm reach requires six times more peak torque in one direction than another, in terms of the Jacobian and the configuration-dependence of M(q).</w:t>
+        <w:t xml:space="preserve">2.  Explain why the same 8 cm reach requires six times more peak torque in one direction than another, in terms of the Jacobian and the configuration-dependence of M(q).</w:t>
       </w:r>
     </w:p>
     <w:p>
@@ -172,16 +156,7 @@
           <w:sz w:val="22"/>
           <w:szCs w:val="22"/>
         </w:rPr>
-        <w:t xml:space="preserve">3.  </w:t>
-      </w:r>
-      <w:r>
-        <w:rPr>
-          <w:rFonts w:ascii="Cambria" w:cs="Cambria" w:eastAsia="Cambria" w:hAnsi="Cambria"/>
-          <w:color w:val="333333"/>
-          <w:sz w:val="22"/>
-          <w:szCs w:val="22"/>
-        </w:rPr>
-        <w:t xml:space="preserve">Add an external load to the equations of motion through the term −J(q)ᵀF, and explain why the Jacobian must be evaluated at the current configuration.</w:t>
+        <w:t xml:space="preserve">3.  Add an external load to the equations of motion through the term −J(q)ᵀF, and explain why the Jacobian must be evaluated at the current configuration.</w:t>
       </w:r>
     </w:p>
     <w:p>
@@ -196,16 +171,7 @@
           <w:sz w:val="22"/>
           <w:szCs w:val="22"/>
         </w:rPr>
-        <w:t xml:space="preserve">4.  </w:t>
-      </w:r>
-      <w:r>
-        <w:rPr>
-          <w:rFonts w:ascii="Cambria" w:cs="Cambria" w:eastAsia="Cambria" w:hAnsi="Cambria"/>
-          <w:color w:val="333333"/>
-          <w:sz w:val="22"/>
-          <w:szCs w:val="22"/>
-        </w:rPr>
-        <w:t xml:space="preserve">State the muscle redundancy problem precisely, and explain why the non-negativity constraint F ≥ 0 makes the usable redundancy far smaller than the dimension of the null space.</w:t>
+        <w:t xml:space="preserve">4.  State the muscle redundancy problem precisely, and explain why the non-negativity constraint F ≥ 0 makes the usable redundancy far smaller than the dimension of the null space.</w:t>
       </w:r>
     </w:p>
     <w:p>
@@ -220,16 +186,7 @@
           <w:sz w:val="22"/>
           <w:szCs w:val="22"/>
         </w:rPr>
-        <w:t xml:space="preserve">5.  </w:t>
-      </w:r>
-      <w:r>
-        <w:rPr>
-          <w:rFonts w:ascii="Cambria" w:cs="Cambria" w:eastAsia="Cambria" w:hAnsi="Cambria"/>
-          <w:color w:val="333333"/>
-          <w:sz w:val="22"/>
-          <w:szCs w:val="22"/>
-        </w:rPr>
-        <w:t xml:space="preserve">Solve the redundancy problem by static optimization using the Crowninshield &amp; Brand criterion, and explain what the choice of cost exponent does and does not control.</w:t>
+        <w:t xml:space="preserve">5.  Solve the redundancy problem by static optimization using the Crowninshield &amp; Brand criterion, and explain what the choice of cost exponent does and does not control.</w:t>
       </w:r>
     </w:p>
     <w:p>
@@ -244,20 +201,12 @@
           <w:sz w:val="22"/>
           <w:szCs w:val="22"/>
         </w:rPr>
-        <w:t xml:space="preserve">6.  </w:t>
-      </w:r>
-      <w:r>
-        <w:rPr>
-          <w:rFonts w:ascii="Cambria" w:cs="Cambria" w:eastAsia="Cambria" w:hAnsi="Cambria"/>
-          <w:color w:val="333333"/>
-          <w:sz w:val="22"/>
-          <w:szCs w:val="22"/>
-        </w:rPr>
-        <w:t xml:space="preserve">Distinguish the two numerical choices in the pipeline — the differentiation step and the integration step — and explain why they are separate decisions.</w:t>
-      </w:r>
-    </w:p>
-    <w:p>
-      <w:pPr>
+        <w:t xml:space="preserve">6.  Distinguish the two numerical choices in the pipeline — the differentiation step and the integration step — and explain why they are separate decisions.</w:t>
+      </w:r>
+    </w:p>
+    <w:p>
+      <w:pPr>
+        <w:keepNext/>
         <w:spacing w:after="160" w:before="340"/>
       </w:pPr>
       <w:r>
@@ -422,6 +371,7 @@
     </w:p>
     <w:p>
       <w:pPr>
+        <w:keepNext/>
         <w:spacing w:after="160" w:before="340"/>
       </w:pPr>
       <w:r>
@@ -534,6 +484,7 @@
           </w:tcPr>
           <w:p>
             <w:pPr>
+              <w:keepNext/>
               <w:spacing w:after="90"/>
             </w:pPr>
             <w:r>
@@ -567,6 +518,7 @@
     </w:tbl>
     <w:p>
       <w:pPr>
+        <w:keepNext/>
         <w:spacing w:after="90" w:before="200"/>
         <w:jc w:val="center"/>
       </w:pPr>
@@ -640,6 +592,7 @@
     </w:p>
     <w:p>
       <w:pPr>
+        <w:keepNext/>
         <w:spacing w:after="130" w:before="280"/>
       </w:pPr>
       <w:r>
@@ -670,6 +623,7 @@
     </w:p>
     <w:p>
       <w:pPr>
+        <w:keepNext/>
         <w:spacing w:after="160" w:before="340"/>
       </w:pPr>
       <w:r>
@@ -700,6 +654,7 @@
     </w:p>
     <w:p>
       <w:pPr>
+        <w:keepNext/>
         <w:spacing w:after="90" w:before="200"/>
         <w:jc w:val="center"/>
       </w:pPr>
@@ -884,6 +839,7 @@
           </w:tcPr>
           <w:p>
             <w:pPr>
+              <w:keepNext/>
               <w:spacing w:after="90"/>
             </w:pPr>
             <w:r>
@@ -917,6 +873,7 @@
     </w:tbl>
     <w:p>
       <w:pPr>
+        <w:keepNext/>
         <w:spacing w:after="160" w:before="340"/>
       </w:pPr>
       <w:r>
@@ -947,6 +904,7 @@
     </w:p>
     <w:p>
       <w:pPr>
+        <w:keepNext/>
         <w:spacing w:after="90" w:before="200"/>
         <w:jc w:val="center"/>
       </w:pPr>
@@ -1020,6 +978,7 @@
     </w:p>
     <w:p>
       <w:pPr>
+        <w:keepNext/>
         <w:spacing w:after="130" w:before="280"/>
       </w:pPr>
       <w:r>
@@ -1229,6 +1188,7 @@
           </w:tcPr>
           <w:p>
             <w:pPr>
+              <w:keepNext/>
               <w:spacing w:after="90"/>
             </w:pPr>
             <w:r>
@@ -1262,6 +1222,7 @@
     </w:tbl>
     <w:p>
       <w:pPr>
+        <w:keepNext/>
         <w:spacing w:after="130" w:before="280"/>
       </w:pPr>
       <w:r>
@@ -1333,6 +1294,7 @@
           </w:tcPr>
           <w:p>
             <w:pPr>
+              <w:keepNext/>
               <w:spacing w:after="90"/>
             </w:pPr>
             <w:r>
@@ -1386,6 +1348,7 @@
     </w:tbl>
     <w:p>
       <w:pPr>
+        <w:keepNext/>
         <w:spacing w:after="160" w:before="340"/>
       </w:pPr>
       <w:r>
@@ -1471,6 +1434,7 @@
     </w:p>
     <w:p>
       <w:pPr>
+        <w:keepNext/>
         <w:spacing w:after="130" w:before="280"/>
       </w:pPr>
       <w:r>
@@ -1520,6 +1484,7 @@
     </w:p>
     <w:p>
       <w:pPr>
+        <w:keepNext/>
         <w:spacing w:after="160" w:before="340"/>
       </w:pPr>
       <w:r>
@@ -1605,6 +1570,7 @@
     </w:p>
     <w:p>
       <w:pPr>
+        <w:keepNext/>
         <w:spacing w:after="90" w:before="200"/>
         <w:jc w:val="center"/>
       </w:pPr>
@@ -1678,6 +1644,7 @@
     </w:p>
     <w:p>
       <w:pPr>
+        <w:keepNext/>
         <w:spacing w:after="130" w:before="280"/>
       </w:pPr>
       <w:r>
@@ -1736,6 +1703,7 @@
     </w:p>
     <w:p>
       <w:pPr>
+        <w:keepNext/>
         <w:spacing w:after="130" w:before="280"/>
       </w:pPr>
       <w:r>
@@ -1766,6 +1734,7 @@
     </w:p>
     <w:p>
       <w:pPr>
+        <w:keepNext/>
         <w:spacing w:after="90" w:before="200"/>
         <w:jc w:val="center"/>
       </w:pPr>
@@ -1862,7 +1831,1602 @@
           <w:sz w:val="22"/>
           <w:szCs w:val="22"/>
         </w:rPr>
-        <w:t xml:space="preserve">It is worth doing this arithmetic once, because co-contraction is routinely misremembered as meaning the joint carries no net torque. It does not. Take the two force vectors from the in-class exercise. F_A = (0, 0, 0, 30, 0, 10) N puts nothing into pec, so at the shoulder only deltoid and triceps long pull, contributing −1.20 and −0.40 N·m: a net of −1.60 N·m, with no opposing torque anywhere. F_B = (10, 0, 0, 40, 0, 10) N adds 10 N to pec and 10 N to deltoid. Now pec pulls +0.40 N·m while deltoid and triceps long pull −2.00 N·m. Those still sum to −1.60 — the same net torque, the same movement — but 0.40 N·m of torque is now generated in one direction and cancelled in the other.</w:t>
+        <w:t xml:space="preserve">Co-contraction is often taken to mean that the joint carries no net torque. It does not, and the two force vectors from the in-class exercise show why. Both list forces in the order (pec, bic_l, bic_s, delt, tri_l, tri_lg): F</w:t>
+      </w:r>
+      <w:r>
+        <w:rPr>
+          <w:rFonts w:ascii="Cambria" w:cs="Cambria" w:eastAsia="Cambria" w:hAnsi="Cambria"/>
+          <w:color w:val="333333"/>
+          <w:sz w:val="22"/>
+          <w:szCs w:val="22"/>
+          <w:vertAlign w:val="subscript"/>
+        </w:rPr>
+        <w:t xml:space="preserve">A</w:t>
+      </w:r>
+      <w:r>
+        <w:rPr>
+          <w:rFonts w:ascii="Cambria" w:cs="Cambria" w:eastAsia="Cambria" w:hAnsi="Cambria"/>
+          <w:color w:val="333333"/>
+          <w:sz w:val="22"/>
+          <w:szCs w:val="22"/>
+        </w:rPr>
+        <w:t xml:space="preserve"> = (0, 0, 0, 30, 0, 10) N and F</w:t>
+      </w:r>
+      <w:r>
+        <w:rPr>
+          <w:rFonts w:ascii="Cambria" w:cs="Cambria" w:eastAsia="Cambria" w:hAnsi="Cambria"/>
+          <w:color w:val="333333"/>
+          <w:sz w:val="22"/>
+          <w:szCs w:val="22"/>
+          <w:vertAlign w:val="subscript"/>
+        </w:rPr>
+        <w:t xml:space="preserve">B</w:t>
+      </w:r>
+      <w:r>
+        <w:rPr>
+          <w:rFonts w:ascii="Cambria" w:cs="Cambria" w:eastAsia="Cambria" w:hAnsi="Cambria"/>
+          <w:color w:val="333333"/>
+          <w:sz w:val="22"/>
+          <w:szCs w:val="22"/>
+        </w:rPr>
+        <w:t xml:space="preserve"> = (10, 0, 0, 40, 0, 10) N. The table below multiplies each force by the muscle’s shoulder moment arm to get its shoulder torque. Only pec, delt and tri_lg appear, because the other three contribute nothing: bic_l and tri_l do not cross the shoulder, and bic_s carries no force in either vector.</w:t>
+      </w:r>
+    </w:p>
+    <w:tbl>
+      <w:tblPr>
+        <w:tblW w:type="dxa" w:w="9360"/>
+        <w:tblBorders>
+          <w:top w:val="single" w:color="auto" w:sz="4"/>
+          <w:left w:val="single" w:color="auto" w:sz="4"/>
+          <w:bottom w:val="single" w:color="auto" w:sz="4"/>
+          <w:right w:val="single" w:color="auto" w:sz="4"/>
+          <w:insideH w:val="single" w:color="auto" w:sz="4"/>
+          <w:insideV w:val="single" w:color="auto" w:sz="4"/>
+        </w:tblBorders>
+      </w:tblPr>
+      <w:tblGrid>
+        <w:gridCol w:w="1560"/>
+        <w:gridCol w:w="1560"/>
+        <w:gridCol w:w="1560"/>
+        <w:gridCol w:w="1560"/>
+        <w:gridCol w:w="1560"/>
+        <w:gridCol w:w="1560"/>
+      </w:tblGrid>
+      <w:tr>
+        <w:trPr>
+          <w:tblHeader/>
+        </w:trPr>
+        <w:tc>
+          <w:tcPr>
+            <w:tcW w:type="dxa" w:w="1560"/>
+            <w:shd w:fill="1B2A4A" w:color="auto" w:val="clear"/>
+            <w:tcMar>
+              <w:top w:type="dxa" w:w="70"/>
+              <w:left w:type="dxa" w:w="100"/>
+              <w:bottom w:type="dxa" w:w="70"/>
+              <w:right w:type="dxa" w:w="100"/>
+            </w:tcMar>
+          </w:tcPr>
+          <w:p>
+            <w:pPr>
+              <w:spacing w:after="0"/>
+              <w:jc w:val="left"/>
+            </w:pPr>
+            <w:r>
+              <w:rPr>
+                <w:rFonts w:ascii="Cambria" w:cs="Cambria" w:eastAsia="Cambria" w:hAnsi="Cambria"/>
+                <w:b/>
+                <w:bCs/>
+                <w:color w:val="FFFFFF"/>
+                <w:sz w:val="20"/>
+                <w:szCs w:val="20"/>
+              </w:rPr>
+              <w:t xml:space="preserve">Muscle</w:t>
+            </w:r>
+          </w:p>
+        </w:tc>
+        <w:tc>
+          <w:tcPr>
+            <w:tcW w:type="dxa" w:w="1560"/>
+            <w:shd w:fill="1B2A4A" w:color="auto" w:val="clear"/>
+            <w:tcMar>
+              <w:top w:type="dxa" w:w="70"/>
+              <w:left w:type="dxa" w:w="100"/>
+              <w:bottom w:type="dxa" w:w="70"/>
+              <w:right w:type="dxa" w:w="100"/>
+            </w:tcMar>
+          </w:tcPr>
+          <w:p>
+            <w:pPr>
+              <w:spacing w:after="0"/>
+              <w:jc w:val="center"/>
+            </w:pPr>
+            <w:r>
+              <w:rPr>
+                <w:rFonts w:ascii="Cambria" w:cs="Cambria" w:eastAsia="Cambria" w:hAnsi="Cambria"/>
+                <w:b/>
+                <w:bCs/>
+                <w:color w:val="FFFFFF"/>
+                <w:sz w:val="20"/>
+                <w:szCs w:val="20"/>
+              </w:rPr>
+              <w:t xml:space="preserve">Shoulder moment arm (m)</w:t>
+            </w:r>
+          </w:p>
+        </w:tc>
+        <w:tc>
+          <w:tcPr>
+            <w:tcW w:type="dxa" w:w="1560"/>
+            <w:shd w:fill="1B2A4A" w:color="auto" w:val="clear"/>
+            <w:tcMar>
+              <w:top w:type="dxa" w:w="70"/>
+              <w:left w:type="dxa" w:w="100"/>
+              <w:bottom w:type="dxa" w:w="70"/>
+              <w:right w:type="dxa" w:w="100"/>
+            </w:tcMar>
+          </w:tcPr>
+          <w:p>
+            <w:pPr>
+              <w:spacing w:after="0"/>
+              <w:jc w:val="center"/>
+            </w:pPr>
+            <w:r>
+              <w:rPr>
+                <w:rFonts w:ascii="Cambria" w:cs="Cambria" w:eastAsia="Cambria" w:hAnsi="Cambria"/>
+                <w:b/>
+                <w:bCs/>
+                <w:color w:val="FFFFFF"/>
+                <w:sz w:val="20"/>
+                <w:szCs w:val="20"/>
+              </w:rPr>
+              <w:t xml:space="preserve">Force in F</w:t>
+            </w:r>
+            <w:r>
+              <w:rPr>
+                <w:rFonts w:ascii="Cambria" w:cs="Cambria" w:eastAsia="Cambria" w:hAnsi="Cambria"/>
+                <w:b/>
+                <w:bCs/>
+                <w:color w:val="FFFFFF"/>
+                <w:sz w:val="20"/>
+                <w:szCs w:val="20"/>
+                <w:vertAlign w:val="subscript"/>
+              </w:rPr>
+              <w:t xml:space="preserve">A</w:t>
+            </w:r>
+            <w:r>
+              <w:rPr>
+                <w:rFonts w:ascii="Cambria" w:cs="Cambria" w:eastAsia="Cambria" w:hAnsi="Cambria"/>
+                <w:b/>
+                <w:bCs/>
+                <w:color w:val="FFFFFF"/>
+                <w:sz w:val="20"/>
+                <w:szCs w:val="20"/>
+              </w:rPr>
+              <w:t xml:space="preserve"> (N)</w:t>
+            </w:r>
+          </w:p>
+        </w:tc>
+        <w:tc>
+          <w:tcPr>
+            <w:tcW w:type="dxa" w:w="1560"/>
+            <w:shd w:fill="1B2A4A" w:color="auto" w:val="clear"/>
+            <w:tcMar>
+              <w:top w:type="dxa" w:w="70"/>
+              <w:left w:type="dxa" w:w="100"/>
+              <w:bottom w:type="dxa" w:w="70"/>
+              <w:right w:type="dxa" w:w="100"/>
+            </w:tcMar>
+          </w:tcPr>
+          <w:p>
+            <w:pPr>
+              <w:spacing w:after="0"/>
+              <w:jc w:val="center"/>
+            </w:pPr>
+            <w:r>
+              <w:rPr>
+                <w:rFonts w:ascii="Cambria" w:cs="Cambria" w:eastAsia="Cambria" w:hAnsi="Cambria"/>
+                <w:b/>
+                <w:bCs/>
+                <w:color w:val="FFFFFF"/>
+                <w:sz w:val="20"/>
+                <w:szCs w:val="20"/>
+              </w:rPr>
+              <w:t xml:space="preserve">Torque from F</w:t>
+            </w:r>
+            <w:r>
+              <w:rPr>
+                <w:rFonts w:ascii="Cambria" w:cs="Cambria" w:eastAsia="Cambria" w:hAnsi="Cambria"/>
+                <w:b/>
+                <w:bCs/>
+                <w:color w:val="FFFFFF"/>
+                <w:sz w:val="20"/>
+                <w:szCs w:val="20"/>
+                <w:vertAlign w:val="subscript"/>
+              </w:rPr>
+              <w:t xml:space="preserve">A</w:t>
+            </w:r>
+            <w:r>
+              <w:rPr>
+                <w:rFonts w:ascii="Cambria" w:cs="Cambria" w:eastAsia="Cambria" w:hAnsi="Cambria"/>
+                <w:b/>
+                <w:bCs/>
+                <w:color w:val="FFFFFF"/>
+                <w:sz w:val="20"/>
+                <w:szCs w:val="20"/>
+              </w:rPr>
+              <w:t xml:space="preserve"> (N·m)</w:t>
+            </w:r>
+          </w:p>
+        </w:tc>
+        <w:tc>
+          <w:tcPr>
+            <w:tcW w:type="dxa" w:w="1560"/>
+            <w:shd w:fill="1B2A4A" w:color="auto" w:val="clear"/>
+            <w:tcMar>
+              <w:top w:type="dxa" w:w="70"/>
+              <w:left w:type="dxa" w:w="100"/>
+              <w:bottom w:type="dxa" w:w="70"/>
+              <w:right w:type="dxa" w:w="100"/>
+            </w:tcMar>
+          </w:tcPr>
+          <w:p>
+            <w:pPr>
+              <w:spacing w:after="0"/>
+              <w:jc w:val="center"/>
+            </w:pPr>
+            <w:r>
+              <w:rPr>
+                <w:rFonts w:ascii="Cambria" w:cs="Cambria" w:eastAsia="Cambria" w:hAnsi="Cambria"/>
+                <w:b/>
+                <w:bCs/>
+                <w:color w:val="FFFFFF"/>
+                <w:sz w:val="20"/>
+                <w:szCs w:val="20"/>
+              </w:rPr>
+              <w:t xml:space="preserve">Force in F</w:t>
+            </w:r>
+            <w:r>
+              <w:rPr>
+                <w:rFonts w:ascii="Cambria" w:cs="Cambria" w:eastAsia="Cambria" w:hAnsi="Cambria"/>
+                <w:b/>
+                <w:bCs/>
+                <w:color w:val="FFFFFF"/>
+                <w:sz w:val="20"/>
+                <w:szCs w:val="20"/>
+                <w:vertAlign w:val="subscript"/>
+              </w:rPr>
+              <w:t xml:space="preserve">B</w:t>
+            </w:r>
+            <w:r>
+              <w:rPr>
+                <w:rFonts w:ascii="Cambria" w:cs="Cambria" w:eastAsia="Cambria" w:hAnsi="Cambria"/>
+                <w:b/>
+                <w:bCs/>
+                <w:color w:val="FFFFFF"/>
+                <w:sz w:val="20"/>
+                <w:szCs w:val="20"/>
+              </w:rPr>
+              <w:t xml:space="preserve"> (N)</w:t>
+            </w:r>
+          </w:p>
+        </w:tc>
+        <w:tc>
+          <w:tcPr>
+            <w:tcW w:type="dxa" w:w="1560"/>
+            <w:shd w:fill="1B2A4A" w:color="auto" w:val="clear"/>
+            <w:tcMar>
+              <w:top w:type="dxa" w:w="70"/>
+              <w:left w:type="dxa" w:w="100"/>
+              <w:bottom w:type="dxa" w:w="70"/>
+              <w:right w:type="dxa" w:w="100"/>
+            </w:tcMar>
+          </w:tcPr>
+          <w:p>
+            <w:pPr>
+              <w:spacing w:after="0"/>
+              <w:jc w:val="center"/>
+            </w:pPr>
+            <w:r>
+              <w:rPr>
+                <w:rFonts w:ascii="Cambria" w:cs="Cambria" w:eastAsia="Cambria" w:hAnsi="Cambria"/>
+                <w:b/>
+                <w:bCs/>
+                <w:color w:val="FFFFFF"/>
+                <w:sz w:val="20"/>
+                <w:szCs w:val="20"/>
+              </w:rPr>
+              <w:t xml:space="preserve">Torque from F</w:t>
+            </w:r>
+            <w:r>
+              <w:rPr>
+                <w:rFonts w:ascii="Cambria" w:cs="Cambria" w:eastAsia="Cambria" w:hAnsi="Cambria"/>
+                <w:b/>
+                <w:bCs/>
+                <w:color w:val="FFFFFF"/>
+                <w:sz w:val="20"/>
+                <w:szCs w:val="20"/>
+                <w:vertAlign w:val="subscript"/>
+              </w:rPr>
+              <w:t xml:space="preserve">B</w:t>
+            </w:r>
+            <w:r>
+              <w:rPr>
+                <w:rFonts w:ascii="Cambria" w:cs="Cambria" w:eastAsia="Cambria" w:hAnsi="Cambria"/>
+                <w:b/>
+                <w:bCs/>
+                <w:color w:val="FFFFFF"/>
+                <w:sz w:val="20"/>
+                <w:szCs w:val="20"/>
+              </w:rPr>
+              <w:t xml:space="preserve"> (N·m)</w:t>
+            </w:r>
+          </w:p>
+        </w:tc>
+      </w:tr>
+      <w:tr>
+        <w:tc>
+          <w:tcPr>
+            <w:tcW w:type="dxa" w:w="1560"/>
+            <w:tcMar>
+              <w:top w:type="dxa" w:w="70"/>
+              <w:left w:type="dxa" w:w="100"/>
+              <w:bottom w:type="dxa" w:w="70"/>
+              <w:right w:type="dxa" w:w="100"/>
+            </w:tcMar>
+          </w:tcPr>
+          <w:p>
+            <w:pPr>
+              <w:spacing w:after="0"/>
+              <w:jc w:val="left"/>
+            </w:pPr>
+            <w:r>
+              <w:rPr>
+                <w:rFonts w:ascii="Cambria" w:cs="Cambria" w:eastAsia="Cambria" w:hAnsi="Cambria"/>
+                <w:b/>
+                <w:bCs/>
+                <w:color w:val="333333"/>
+                <w:sz w:val="20"/>
+                <w:szCs w:val="20"/>
+              </w:rPr>
+              <w:t xml:space="preserve">pec</w:t>
+            </w:r>
+          </w:p>
+        </w:tc>
+        <w:tc>
+          <w:tcPr>
+            <w:tcW w:type="dxa" w:w="1560"/>
+            <w:tcMar>
+              <w:top w:type="dxa" w:w="70"/>
+              <w:left w:type="dxa" w:w="100"/>
+              <w:bottom w:type="dxa" w:w="70"/>
+              <w:right w:type="dxa" w:w="100"/>
+            </w:tcMar>
+          </w:tcPr>
+          <w:p>
+            <w:pPr>
+              <w:spacing w:after="0"/>
+              <w:jc w:val="center"/>
+            </w:pPr>
+            <w:r>
+              <w:rPr>
+                <w:rFonts w:ascii="Cambria" w:cs="Cambria" w:eastAsia="Cambria" w:hAnsi="Cambria"/>
+                <w:color w:val="333333"/>
+                <w:sz w:val="20"/>
+                <w:szCs w:val="20"/>
+              </w:rPr>
+              <w:t xml:space="preserve">+0.04</w:t>
+            </w:r>
+          </w:p>
+        </w:tc>
+        <w:tc>
+          <w:tcPr>
+            <w:tcW w:type="dxa" w:w="1560"/>
+            <w:tcMar>
+              <w:top w:type="dxa" w:w="70"/>
+              <w:left w:type="dxa" w:w="100"/>
+              <w:bottom w:type="dxa" w:w="70"/>
+              <w:right w:type="dxa" w:w="100"/>
+            </w:tcMar>
+          </w:tcPr>
+          <w:p>
+            <w:pPr>
+              <w:spacing w:after="0"/>
+              <w:jc w:val="center"/>
+            </w:pPr>
+            <w:r>
+              <w:rPr>
+                <w:rFonts w:ascii="Cambria" w:cs="Cambria" w:eastAsia="Cambria" w:hAnsi="Cambria"/>
+                <w:color w:val="333333"/>
+                <w:sz w:val="20"/>
+                <w:szCs w:val="20"/>
+              </w:rPr>
+              <w:t xml:space="preserve">0</w:t>
+            </w:r>
+          </w:p>
+        </w:tc>
+        <w:tc>
+          <w:tcPr>
+            <w:tcW w:type="dxa" w:w="1560"/>
+            <w:tcMar>
+              <w:top w:type="dxa" w:w="70"/>
+              <w:left w:type="dxa" w:w="100"/>
+              <w:bottom w:type="dxa" w:w="70"/>
+              <w:right w:type="dxa" w:w="100"/>
+            </w:tcMar>
+          </w:tcPr>
+          <w:p>
+            <w:pPr>
+              <w:spacing w:after="0"/>
+              <w:jc w:val="center"/>
+            </w:pPr>
+            <w:r>
+              <w:rPr>
+                <w:rFonts w:ascii="Cambria" w:cs="Cambria" w:eastAsia="Cambria" w:hAnsi="Cambria"/>
+                <w:color w:val="333333"/>
+                <w:sz w:val="20"/>
+                <w:szCs w:val="20"/>
+              </w:rPr>
+              <w:t xml:space="preserve">0.00</w:t>
+            </w:r>
+          </w:p>
+        </w:tc>
+        <w:tc>
+          <w:tcPr>
+            <w:tcW w:type="dxa" w:w="1560"/>
+            <w:tcMar>
+              <w:top w:type="dxa" w:w="70"/>
+              <w:left w:type="dxa" w:w="100"/>
+              <w:bottom w:type="dxa" w:w="70"/>
+              <w:right w:type="dxa" w:w="100"/>
+            </w:tcMar>
+          </w:tcPr>
+          <w:p>
+            <w:pPr>
+              <w:spacing w:after="0"/>
+              <w:jc w:val="center"/>
+            </w:pPr>
+            <w:r>
+              <w:rPr>
+                <w:rFonts w:ascii="Cambria" w:cs="Cambria" w:eastAsia="Cambria" w:hAnsi="Cambria"/>
+                <w:color w:val="333333"/>
+                <w:sz w:val="20"/>
+                <w:szCs w:val="20"/>
+              </w:rPr>
+              <w:t xml:space="preserve">10</w:t>
+            </w:r>
+          </w:p>
+        </w:tc>
+        <w:tc>
+          <w:tcPr>
+            <w:tcW w:type="dxa" w:w="1560"/>
+            <w:tcMar>
+              <w:top w:type="dxa" w:w="70"/>
+              <w:left w:type="dxa" w:w="100"/>
+              <w:bottom w:type="dxa" w:w="70"/>
+              <w:right w:type="dxa" w:w="100"/>
+            </w:tcMar>
+          </w:tcPr>
+          <w:p>
+            <w:pPr>
+              <w:spacing w:after="0"/>
+              <w:jc w:val="center"/>
+            </w:pPr>
+            <w:r>
+              <w:rPr>
+                <w:rFonts w:ascii="Cambria" w:cs="Cambria" w:eastAsia="Cambria" w:hAnsi="Cambria"/>
+                <w:color w:val="333333"/>
+                <w:sz w:val="20"/>
+                <w:szCs w:val="20"/>
+              </w:rPr>
+              <w:t xml:space="preserve">+0.40</w:t>
+            </w:r>
+          </w:p>
+        </w:tc>
+      </w:tr>
+      <w:tr>
+        <w:tc>
+          <w:tcPr>
+            <w:tcW w:type="dxa" w:w="1560"/>
+            <w:shd w:fill="F0F5FA" w:color="auto" w:val="clear"/>
+            <w:tcMar>
+              <w:top w:type="dxa" w:w="70"/>
+              <w:left w:type="dxa" w:w="100"/>
+              <w:bottom w:type="dxa" w:w="70"/>
+              <w:right w:type="dxa" w:w="100"/>
+            </w:tcMar>
+          </w:tcPr>
+          <w:p>
+            <w:pPr>
+              <w:spacing w:after="0"/>
+              <w:jc w:val="left"/>
+            </w:pPr>
+            <w:r>
+              <w:rPr>
+                <w:rFonts w:ascii="Cambria" w:cs="Cambria" w:eastAsia="Cambria" w:hAnsi="Cambria"/>
+                <w:b/>
+                <w:bCs/>
+                <w:color w:val="333333"/>
+                <w:sz w:val="20"/>
+                <w:szCs w:val="20"/>
+              </w:rPr>
+              <w:t xml:space="preserve">delt</w:t>
+            </w:r>
+          </w:p>
+        </w:tc>
+        <w:tc>
+          <w:tcPr>
+            <w:tcW w:type="dxa" w:w="1560"/>
+            <w:shd w:fill="F0F5FA" w:color="auto" w:val="clear"/>
+            <w:tcMar>
+              <w:top w:type="dxa" w:w="70"/>
+              <w:left w:type="dxa" w:w="100"/>
+              <w:bottom w:type="dxa" w:w="70"/>
+              <w:right w:type="dxa" w:w="100"/>
+            </w:tcMar>
+          </w:tcPr>
+          <w:p>
+            <w:pPr>
+              <w:spacing w:after="0"/>
+              <w:jc w:val="center"/>
+            </w:pPr>
+            <w:r>
+              <w:rPr>
+                <w:rFonts w:ascii="Cambria" w:cs="Cambria" w:eastAsia="Cambria" w:hAnsi="Cambria"/>
+                <w:color w:val="333333"/>
+                <w:sz w:val="20"/>
+                <w:szCs w:val="20"/>
+              </w:rPr>
+              <w:t xml:space="preserve">−0.04</w:t>
+            </w:r>
+          </w:p>
+        </w:tc>
+        <w:tc>
+          <w:tcPr>
+            <w:tcW w:type="dxa" w:w="1560"/>
+            <w:shd w:fill="F0F5FA" w:color="auto" w:val="clear"/>
+            <w:tcMar>
+              <w:top w:type="dxa" w:w="70"/>
+              <w:left w:type="dxa" w:w="100"/>
+              <w:bottom w:type="dxa" w:w="70"/>
+              <w:right w:type="dxa" w:w="100"/>
+            </w:tcMar>
+          </w:tcPr>
+          <w:p>
+            <w:pPr>
+              <w:spacing w:after="0"/>
+              <w:jc w:val="center"/>
+            </w:pPr>
+            <w:r>
+              <w:rPr>
+                <w:rFonts w:ascii="Cambria" w:cs="Cambria" w:eastAsia="Cambria" w:hAnsi="Cambria"/>
+                <w:color w:val="333333"/>
+                <w:sz w:val="20"/>
+                <w:szCs w:val="20"/>
+              </w:rPr>
+              <w:t xml:space="preserve">30</w:t>
+            </w:r>
+          </w:p>
+        </w:tc>
+        <w:tc>
+          <w:tcPr>
+            <w:tcW w:type="dxa" w:w="1560"/>
+            <w:shd w:fill="F0F5FA" w:color="auto" w:val="clear"/>
+            <w:tcMar>
+              <w:top w:type="dxa" w:w="70"/>
+              <w:left w:type="dxa" w:w="100"/>
+              <w:bottom w:type="dxa" w:w="70"/>
+              <w:right w:type="dxa" w:w="100"/>
+            </w:tcMar>
+          </w:tcPr>
+          <w:p>
+            <w:pPr>
+              <w:spacing w:after="0"/>
+              <w:jc w:val="center"/>
+            </w:pPr>
+            <w:r>
+              <w:rPr>
+                <w:rFonts w:ascii="Cambria" w:cs="Cambria" w:eastAsia="Cambria" w:hAnsi="Cambria"/>
+                <w:color w:val="333333"/>
+                <w:sz w:val="20"/>
+                <w:szCs w:val="20"/>
+              </w:rPr>
+              <w:t xml:space="preserve">−1.20</w:t>
+            </w:r>
+          </w:p>
+        </w:tc>
+        <w:tc>
+          <w:tcPr>
+            <w:tcW w:type="dxa" w:w="1560"/>
+            <w:shd w:fill="F0F5FA" w:color="auto" w:val="clear"/>
+            <w:tcMar>
+              <w:top w:type="dxa" w:w="70"/>
+              <w:left w:type="dxa" w:w="100"/>
+              <w:bottom w:type="dxa" w:w="70"/>
+              <w:right w:type="dxa" w:w="100"/>
+            </w:tcMar>
+          </w:tcPr>
+          <w:p>
+            <w:pPr>
+              <w:spacing w:after="0"/>
+              <w:jc w:val="center"/>
+            </w:pPr>
+            <w:r>
+              <w:rPr>
+                <w:rFonts w:ascii="Cambria" w:cs="Cambria" w:eastAsia="Cambria" w:hAnsi="Cambria"/>
+                <w:color w:val="333333"/>
+                <w:sz w:val="20"/>
+                <w:szCs w:val="20"/>
+              </w:rPr>
+              <w:t xml:space="preserve">40</w:t>
+            </w:r>
+          </w:p>
+        </w:tc>
+        <w:tc>
+          <w:tcPr>
+            <w:tcW w:type="dxa" w:w="1560"/>
+            <w:shd w:fill="F0F5FA" w:color="auto" w:val="clear"/>
+            <w:tcMar>
+              <w:top w:type="dxa" w:w="70"/>
+              <w:left w:type="dxa" w:w="100"/>
+              <w:bottom w:type="dxa" w:w="70"/>
+              <w:right w:type="dxa" w:w="100"/>
+            </w:tcMar>
+          </w:tcPr>
+          <w:p>
+            <w:pPr>
+              <w:spacing w:after="0"/>
+              <w:jc w:val="center"/>
+            </w:pPr>
+            <w:r>
+              <w:rPr>
+                <w:rFonts w:ascii="Cambria" w:cs="Cambria" w:eastAsia="Cambria" w:hAnsi="Cambria"/>
+                <w:color w:val="333333"/>
+                <w:sz w:val="20"/>
+                <w:szCs w:val="20"/>
+              </w:rPr>
+              <w:t xml:space="preserve">−1.60</w:t>
+            </w:r>
+          </w:p>
+        </w:tc>
+      </w:tr>
+      <w:tr>
+        <w:tc>
+          <w:tcPr>
+            <w:tcW w:type="dxa" w:w="1560"/>
+            <w:tcMar>
+              <w:top w:type="dxa" w:w="70"/>
+              <w:left w:type="dxa" w:w="100"/>
+              <w:bottom w:type="dxa" w:w="70"/>
+              <w:right w:type="dxa" w:w="100"/>
+            </w:tcMar>
+          </w:tcPr>
+          <w:p>
+            <w:pPr>
+              <w:spacing w:after="0"/>
+              <w:jc w:val="left"/>
+            </w:pPr>
+            <w:r>
+              <w:rPr>
+                <w:rFonts w:ascii="Cambria" w:cs="Cambria" w:eastAsia="Cambria" w:hAnsi="Cambria"/>
+                <w:b/>
+                <w:bCs/>
+                <w:color w:val="333333"/>
+                <w:sz w:val="20"/>
+                <w:szCs w:val="20"/>
+              </w:rPr>
+              <w:t xml:space="preserve">tri_lg</w:t>
+            </w:r>
+          </w:p>
+        </w:tc>
+        <w:tc>
+          <w:tcPr>
+            <w:tcW w:type="dxa" w:w="1560"/>
+            <w:tcMar>
+              <w:top w:type="dxa" w:w="70"/>
+              <w:left w:type="dxa" w:w="100"/>
+              <w:bottom w:type="dxa" w:w="70"/>
+              <w:right w:type="dxa" w:w="100"/>
+            </w:tcMar>
+          </w:tcPr>
+          <w:p>
+            <w:pPr>
+              <w:spacing w:after="0"/>
+              <w:jc w:val="center"/>
+            </w:pPr>
+            <w:r>
+              <w:rPr>
+                <w:rFonts w:ascii="Cambria" w:cs="Cambria" w:eastAsia="Cambria" w:hAnsi="Cambria"/>
+                <w:color w:val="333333"/>
+                <w:sz w:val="20"/>
+                <w:szCs w:val="20"/>
+              </w:rPr>
+              <w:t xml:space="preserve">−0.04</w:t>
+            </w:r>
+          </w:p>
+        </w:tc>
+        <w:tc>
+          <w:tcPr>
+            <w:tcW w:type="dxa" w:w="1560"/>
+            <w:tcMar>
+              <w:top w:type="dxa" w:w="70"/>
+              <w:left w:type="dxa" w:w="100"/>
+              <w:bottom w:type="dxa" w:w="70"/>
+              <w:right w:type="dxa" w:w="100"/>
+            </w:tcMar>
+          </w:tcPr>
+          <w:p>
+            <w:pPr>
+              <w:spacing w:after="0"/>
+              <w:jc w:val="center"/>
+            </w:pPr>
+            <w:r>
+              <w:rPr>
+                <w:rFonts w:ascii="Cambria" w:cs="Cambria" w:eastAsia="Cambria" w:hAnsi="Cambria"/>
+                <w:color w:val="333333"/>
+                <w:sz w:val="20"/>
+                <w:szCs w:val="20"/>
+              </w:rPr>
+              <w:t xml:space="preserve">10</w:t>
+            </w:r>
+          </w:p>
+        </w:tc>
+        <w:tc>
+          <w:tcPr>
+            <w:tcW w:type="dxa" w:w="1560"/>
+            <w:tcMar>
+              <w:top w:type="dxa" w:w="70"/>
+              <w:left w:type="dxa" w:w="100"/>
+              <w:bottom w:type="dxa" w:w="70"/>
+              <w:right w:type="dxa" w:w="100"/>
+            </w:tcMar>
+          </w:tcPr>
+          <w:p>
+            <w:pPr>
+              <w:spacing w:after="0"/>
+              <w:jc w:val="center"/>
+            </w:pPr>
+            <w:r>
+              <w:rPr>
+                <w:rFonts w:ascii="Cambria" w:cs="Cambria" w:eastAsia="Cambria" w:hAnsi="Cambria"/>
+                <w:color w:val="333333"/>
+                <w:sz w:val="20"/>
+                <w:szCs w:val="20"/>
+              </w:rPr>
+              <w:t xml:space="preserve">−0.40</w:t>
+            </w:r>
+          </w:p>
+        </w:tc>
+        <w:tc>
+          <w:tcPr>
+            <w:tcW w:type="dxa" w:w="1560"/>
+            <w:tcMar>
+              <w:top w:type="dxa" w:w="70"/>
+              <w:left w:type="dxa" w:w="100"/>
+              <w:bottom w:type="dxa" w:w="70"/>
+              <w:right w:type="dxa" w:w="100"/>
+            </w:tcMar>
+          </w:tcPr>
+          <w:p>
+            <w:pPr>
+              <w:spacing w:after="0"/>
+              <w:jc w:val="center"/>
+            </w:pPr>
+            <w:r>
+              <w:rPr>
+                <w:rFonts w:ascii="Cambria" w:cs="Cambria" w:eastAsia="Cambria" w:hAnsi="Cambria"/>
+                <w:color w:val="333333"/>
+                <w:sz w:val="20"/>
+                <w:szCs w:val="20"/>
+              </w:rPr>
+              <w:t xml:space="preserve">10</w:t>
+            </w:r>
+          </w:p>
+        </w:tc>
+        <w:tc>
+          <w:tcPr>
+            <w:tcW w:type="dxa" w:w="1560"/>
+            <w:tcMar>
+              <w:top w:type="dxa" w:w="70"/>
+              <w:left w:type="dxa" w:w="100"/>
+              <w:bottom w:type="dxa" w:w="70"/>
+              <w:right w:type="dxa" w:w="100"/>
+            </w:tcMar>
+          </w:tcPr>
+          <w:p>
+            <w:pPr>
+              <w:spacing w:after="0"/>
+              <w:jc w:val="center"/>
+            </w:pPr>
+            <w:r>
+              <w:rPr>
+                <w:rFonts w:ascii="Cambria" w:cs="Cambria" w:eastAsia="Cambria" w:hAnsi="Cambria"/>
+                <w:color w:val="333333"/>
+                <w:sz w:val="20"/>
+                <w:szCs w:val="20"/>
+              </w:rPr>
+              <w:t xml:space="preserve">−0.40</w:t>
+            </w:r>
+          </w:p>
+        </w:tc>
+      </w:tr>
+      <w:tr>
+        <w:tc>
+          <w:tcPr>
+            <w:tcW w:type="dxa" w:w="3120"/>
+            <w:gridSpan w:val="2"/>
+            <w:tcBorders>
+              <w:top w:val="single" w:color="1B2A4A" w:sz="12"/>
+            </w:tcBorders>
+            <w:shd w:fill="F0F5FA" w:color="auto" w:val="clear"/>
+            <w:tcMar>
+              <w:top w:type="dxa" w:w="70"/>
+              <w:left w:type="dxa" w:w="100"/>
+              <w:bottom w:type="dxa" w:w="70"/>
+              <w:right w:type="dxa" w:w="100"/>
+            </w:tcMar>
+          </w:tcPr>
+          <w:p>
+            <w:pPr>
+              <w:spacing w:after="0"/>
+              <w:jc w:val="left"/>
+            </w:pPr>
+            <w:r>
+              <w:rPr>
+                <w:rFonts w:ascii="Cambria" w:cs="Cambria" w:eastAsia="Cambria" w:hAnsi="Cambria"/>
+                <w:b/>
+                <w:bCs/>
+                <w:color w:val="333333"/>
+                <w:sz w:val="20"/>
+                <w:szCs w:val="20"/>
+              </w:rPr>
+              <w:t xml:space="preserve">Flexor total (+)</w:t>
+            </w:r>
+          </w:p>
+        </w:tc>
+        <w:tc>
+          <w:tcPr>
+            <w:tcW w:type="dxa" w:w="1560"/>
+            <w:tcBorders>
+              <w:top w:val="single" w:color="1B2A4A" w:sz="12"/>
+            </w:tcBorders>
+            <w:shd w:fill="F0F5FA" w:color="auto" w:val="clear"/>
+            <w:tcMar>
+              <w:top w:type="dxa" w:w="70"/>
+              <w:left w:type="dxa" w:w="100"/>
+              <w:bottom w:type="dxa" w:w="70"/>
+              <w:right w:type="dxa" w:w="100"/>
+            </w:tcMar>
+          </w:tcPr>
+          <w:p>
+            <w:pPr>
+              <w:spacing w:after="0"/>
+              <w:jc w:val="center"/>
+            </w:pPr>
+          </w:p>
+        </w:tc>
+        <w:tc>
+          <w:tcPr>
+            <w:tcW w:type="dxa" w:w="1560"/>
+            <w:tcBorders>
+              <w:top w:val="single" w:color="1B2A4A" w:sz="12"/>
+            </w:tcBorders>
+            <w:shd w:fill="F0F5FA" w:color="auto" w:val="clear"/>
+            <w:tcMar>
+              <w:top w:type="dxa" w:w="70"/>
+              <w:left w:type="dxa" w:w="100"/>
+              <w:bottom w:type="dxa" w:w="70"/>
+              <w:right w:type="dxa" w:w="100"/>
+            </w:tcMar>
+          </w:tcPr>
+          <w:p>
+            <w:pPr>
+              <w:spacing w:after="0"/>
+              <w:jc w:val="center"/>
+            </w:pPr>
+            <w:r>
+              <w:rPr>
+                <w:rFonts w:ascii="Cambria" w:cs="Cambria" w:eastAsia="Cambria" w:hAnsi="Cambria"/>
+                <w:color w:val="333333"/>
+                <w:sz w:val="20"/>
+                <w:szCs w:val="20"/>
+              </w:rPr>
+              <w:t xml:space="preserve">0.00</w:t>
+            </w:r>
+          </w:p>
+        </w:tc>
+        <w:tc>
+          <w:tcPr>
+            <w:tcW w:type="dxa" w:w="1560"/>
+            <w:tcBorders>
+              <w:top w:val="single" w:color="1B2A4A" w:sz="12"/>
+            </w:tcBorders>
+            <w:shd w:fill="F0F5FA" w:color="auto" w:val="clear"/>
+            <w:tcMar>
+              <w:top w:type="dxa" w:w="70"/>
+              <w:left w:type="dxa" w:w="100"/>
+              <w:bottom w:type="dxa" w:w="70"/>
+              <w:right w:type="dxa" w:w="100"/>
+            </w:tcMar>
+          </w:tcPr>
+          <w:p>
+            <w:pPr>
+              <w:spacing w:after="0"/>
+              <w:jc w:val="center"/>
+            </w:pPr>
+          </w:p>
+        </w:tc>
+        <w:tc>
+          <w:tcPr>
+            <w:tcW w:type="dxa" w:w="1560"/>
+            <w:tcBorders>
+              <w:top w:val="single" w:color="1B2A4A" w:sz="12"/>
+            </w:tcBorders>
+            <w:shd w:fill="F0F5FA" w:color="auto" w:val="clear"/>
+            <w:tcMar>
+              <w:top w:type="dxa" w:w="70"/>
+              <w:left w:type="dxa" w:w="100"/>
+              <w:bottom w:type="dxa" w:w="70"/>
+              <w:right w:type="dxa" w:w="100"/>
+            </w:tcMar>
+          </w:tcPr>
+          <w:p>
+            <w:pPr>
+              <w:spacing w:after="0"/>
+              <w:jc w:val="center"/>
+            </w:pPr>
+            <w:r>
+              <w:rPr>
+                <w:rFonts w:ascii="Cambria" w:cs="Cambria" w:eastAsia="Cambria" w:hAnsi="Cambria"/>
+                <w:color w:val="333333"/>
+                <w:sz w:val="20"/>
+                <w:szCs w:val="20"/>
+              </w:rPr>
+              <w:t xml:space="preserve">+0.40</w:t>
+            </w:r>
+          </w:p>
+        </w:tc>
+      </w:tr>
+      <w:tr>
+        <w:tc>
+          <w:tcPr>
+            <w:tcW w:type="dxa" w:w="3120"/>
+            <w:gridSpan w:val="2"/>
+            <w:tcMar>
+              <w:top w:type="dxa" w:w="70"/>
+              <w:left w:type="dxa" w:w="100"/>
+              <w:bottom w:type="dxa" w:w="70"/>
+              <w:right w:type="dxa" w:w="100"/>
+            </w:tcMar>
+          </w:tcPr>
+          <w:p>
+            <w:pPr>
+              <w:spacing w:after="0"/>
+              <w:jc w:val="left"/>
+            </w:pPr>
+            <w:r>
+              <w:rPr>
+                <w:rFonts w:ascii="Cambria" w:cs="Cambria" w:eastAsia="Cambria" w:hAnsi="Cambria"/>
+                <w:b/>
+                <w:bCs/>
+                <w:color w:val="333333"/>
+                <w:sz w:val="20"/>
+                <w:szCs w:val="20"/>
+              </w:rPr>
+              <w:t xml:space="preserve">Extensor total (−)</w:t>
+            </w:r>
+          </w:p>
+        </w:tc>
+        <w:tc>
+          <w:tcPr>
+            <w:tcW w:type="dxa" w:w="1560"/>
+            <w:tcMar>
+              <w:top w:type="dxa" w:w="70"/>
+              <w:left w:type="dxa" w:w="100"/>
+              <w:bottom w:type="dxa" w:w="70"/>
+              <w:right w:type="dxa" w:w="100"/>
+            </w:tcMar>
+          </w:tcPr>
+          <w:p>
+            <w:pPr>
+              <w:spacing w:after="0"/>
+              <w:jc w:val="center"/>
+            </w:pPr>
+          </w:p>
+        </w:tc>
+        <w:tc>
+          <w:tcPr>
+            <w:tcW w:type="dxa" w:w="1560"/>
+            <w:tcMar>
+              <w:top w:type="dxa" w:w="70"/>
+              <w:left w:type="dxa" w:w="100"/>
+              <w:bottom w:type="dxa" w:w="70"/>
+              <w:right w:type="dxa" w:w="100"/>
+            </w:tcMar>
+          </w:tcPr>
+          <w:p>
+            <w:pPr>
+              <w:spacing w:after="0"/>
+              <w:jc w:val="center"/>
+            </w:pPr>
+            <w:r>
+              <w:rPr>
+                <w:rFonts w:ascii="Cambria" w:cs="Cambria" w:eastAsia="Cambria" w:hAnsi="Cambria"/>
+                <w:color w:val="333333"/>
+                <w:sz w:val="20"/>
+                <w:szCs w:val="20"/>
+              </w:rPr>
+              <w:t xml:space="preserve">−1.60</w:t>
+            </w:r>
+          </w:p>
+        </w:tc>
+        <w:tc>
+          <w:tcPr>
+            <w:tcW w:type="dxa" w:w="1560"/>
+            <w:tcMar>
+              <w:top w:type="dxa" w:w="70"/>
+              <w:left w:type="dxa" w:w="100"/>
+              <w:bottom w:type="dxa" w:w="70"/>
+              <w:right w:type="dxa" w:w="100"/>
+            </w:tcMar>
+          </w:tcPr>
+          <w:p>
+            <w:pPr>
+              <w:spacing w:after="0"/>
+              <w:jc w:val="center"/>
+            </w:pPr>
+          </w:p>
+        </w:tc>
+        <w:tc>
+          <w:tcPr>
+            <w:tcW w:type="dxa" w:w="1560"/>
+            <w:tcMar>
+              <w:top w:type="dxa" w:w="70"/>
+              <w:left w:type="dxa" w:w="100"/>
+              <w:bottom w:type="dxa" w:w="70"/>
+              <w:right w:type="dxa" w:w="100"/>
+            </w:tcMar>
+          </w:tcPr>
+          <w:p>
+            <w:pPr>
+              <w:spacing w:after="0"/>
+              <w:jc w:val="center"/>
+            </w:pPr>
+            <w:r>
+              <w:rPr>
+                <w:rFonts w:ascii="Cambria" w:cs="Cambria" w:eastAsia="Cambria" w:hAnsi="Cambria"/>
+                <w:color w:val="333333"/>
+                <w:sz w:val="20"/>
+                <w:szCs w:val="20"/>
+              </w:rPr>
+              <w:t xml:space="preserve">−2.00</w:t>
+            </w:r>
+          </w:p>
+        </w:tc>
+      </w:tr>
+      <w:tr>
+        <w:tc>
+          <w:tcPr>
+            <w:tcW w:type="dxa" w:w="3120"/>
+            <w:gridSpan w:val="2"/>
+            <w:shd w:fill="F0F5FA" w:color="auto" w:val="clear"/>
+            <w:tcMar>
+              <w:top w:type="dxa" w:w="70"/>
+              <w:left w:type="dxa" w:w="100"/>
+              <w:bottom w:type="dxa" w:w="70"/>
+              <w:right w:type="dxa" w:w="100"/>
+            </w:tcMar>
+          </w:tcPr>
+          <w:p>
+            <w:pPr>
+              <w:spacing w:after="0"/>
+              <w:jc w:val="left"/>
+            </w:pPr>
+            <w:r>
+              <w:rPr>
+                <w:rFonts w:ascii="Cambria" w:cs="Cambria" w:eastAsia="Cambria" w:hAnsi="Cambria"/>
+                <w:b/>
+                <w:bCs/>
+                <w:color w:val="333333"/>
+                <w:sz w:val="20"/>
+                <w:szCs w:val="20"/>
+              </w:rPr>
+              <w:t xml:space="preserve">Net shoulder torque</w:t>
+            </w:r>
+          </w:p>
+        </w:tc>
+        <w:tc>
+          <w:tcPr>
+            <w:tcW w:type="dxa" w:w="1560"/>
+            <w:shd w:fill="F0F5FA" w:color="auto" w:val="clear"/>
+            <w:tcMar>
+              <w:top w:type="dxa" w:w="70"/>
+              <w:left w:type="dxa" w:w="100"/>
+              <w:bottom w:type="dxa" w:w="70"/>
+              <w:right w:type="dxa" w:w="100"/>
+            </w:tcMar>
+          </w:tcPr>
+          <w:p>
+            <w:pPr>
+              <w:spacing w:after="0"/>
+              <w:jc w:val="center"/>
+            </w:pPr>
+          </w:p>
+        </w:tc>
+        <w:tc>
+          <w:tcPr>
+            <w:tcW w:type="dxa" w:w="1560"/>
+            <w:shd w:fill="F0F5FA" w:color="auto" w:val="clear"/>
+            <w:tcMar>
+              <w:top w:type="dxa" w:w="70"/>
+              <w:left w:type="dxa" w:w="100"/>
+              <w:bottom w:type="dxa" w:w="70"/>
+              <w:right w:type="dxa" w:w="100"/>
+            </w:tcMar>
+          </w:tcPr>
+          <w:p>
+            <w:pPr>
+              <w:spacing w:after="0"/>
+              <w:jc w:val="center"/>
+            </w:pPr>
+            <w:r>
+              <w:rPr>
+                <w:rFonts w:ascii="Cambria" w:cs="Cambria" w:eastAsia="Cambria" w:hAnsi="Cambria"/>
+                <w:b/>
+                <w:bCs/>
+                <w:color w:val="333333"/>
+                <w:sz w:val="20"/>
+                <w:szCs w:val="20"/>
+              </w:rPr>
+              <w:t xml:space="preserve">−1.60</w:t>
+            </w:r>
+          </w:p>
+        </w:tc>
+        <w:tc>
+          <w:tcPr>
+            <w:tcW w:type="dxa" w:w="1560"/>
+            <w:shd w:fill="F0F5FA" w:color="auto" w:val="clear"/>
+            <w:tcMar>
+              <w:top w:type="dxa" w:w="70"/>
+              <w:left w:type="dxa" w:w="100"/>
+              <w:bottom w:type="dxa" w:w="70"/>
+              <w:right w:type="dxa" w:w="100"/>
+            </w:tcMar>
+          </w:tcPr>
+          <w:p>
+            <w:pPr>
+              <w:spacing w:after="0"/>
+              <w:jc w:val="center"/>
+            </w:pPr>
+          </w:p>
+        </w:tc>
+        <w:tc>
+          <w:tcPr>
+            <w:tcW w:type="dxa" w:w="1560"/>
+            <w:shd w:fill="F0F5FA" w:color="auto" w:val="clear"/>
+            <w:tcMar>
+              <w:top w:type="dxa" w:w="70"/>
+              <w:left w:type="dxa" w:w="100"/>
+              <w:bottom w:type="dxa" w:w="70"/>
+              <w:right w:type="dxa" w:w="100"/>
+            </w:tcMar>
+          </w:tcPr>
+          <w:p>
+            <w:pPr>
+              <w:spacing w:after="0"/>
+              <w:jc w:val="center"/>
+            </w:pPr>
+            <w:r>
+              <w:rPr>
+                <w:rFonts w:ascii="Cambria" w:cs="Cambria" w:eastAsia="Cambria" w:hAnsi="Cambria"/>
+                <w:b/>
+                <w:bCs/>
+                <w:color w:val="333333"/>
+                <w:sz w:val="20"/>
+                <w:szCs w:val="20"/>
+              </w:rPr>
+              <w:t xml:space="preserve">−1.60</w:t>
+            </w:r>
+          </w:p>
+        </w:tc>
+      </w:tr>
+      <w:tr>
+        <w:tc>
+          <w:tcPr>
+            <w:tcW w:type="dxa" w:w="3120"/>
+            <w:gridSpan w:val="2"/>
+            <w:tcMar>
+              <w:top w:type="dxa" w:w="70"/>
+              <w:left w:type="dxa" w:w="100"/>
+              <w:bottom w:type="dxa" w:w="70"/>
+              <w:right w:type="dxa" w:w="100"/>
+            </w:tcMar>
+          </w:tcPr>
+          <w:p>
+            <w:pPr>
+              <w:spacing w:after="0"/>
+              <w:jc w:val="left"/>
+            </w:pPr>
+            <w:r>
+              <w:rPr>
+                <w:rFonts w:ascii="Cambria" w:cs="Cambria" w:eastAsia="Cambria" w:hAnsi="Cambria"/>
+                <w:b/>
+                <w:bCs/>
+                <w:color w:val="333333"/>
+                <w:sz w:val="20"/>
+                <w:szCs w:val="20"/>
+              </w:rPr>
+              <w:t xml:space="preserve">Co-contraction (canceled torque)</w:t>
+            </w:r>
+          </w:p>
+        </w:tc>
+        <w:tc>
+          <w:tcPr>
+            <w:tcW w:type="dxa" w:w="1560"/>
+            <w:tcMar>
+              <w:top w:type="dxa" w:w="70"/>
+              <w:left w:type="dxa" w:w="100"/>
+              <w:bottom w:type="dxa" w:w="70"/>
+              <w:right w:type="dxa" w:w="100"/>
+            </w:tcMar>
+          </w:tcPr>
+          <w:p>
+            <w:pPr>
+              <w:spacing w:after="0"/>
+              <w:jc w:val="center"/>
+            </w:pPr>
+          </w:p>
+        </w:tc>
+        <w:tc>
+          <w:tcPr>
+            <w:tcW w:type="dxa" w:w="1560"/>
+            <w:tcMar>
+              <w:top w:type="dxa" w:w="70"/>
+              <w:left w:type="dxa" w:w="100"/>
+              <w:bottom w:type="dxa" w:w="70"/>
+              <w:right w:type="dxa" w:w="100"/>
+            </w:tcMar>
+          </w:tcPr>
+          <w:p>
+            <w:pPr>
+              <w:spacing w:after="0"/>
+              <w:jc w:val="center"/>
+            </w:pPr>
+            <w:r>
+              <w:rPr>
+                <w:rFonts w:ascii="Cambria" w:cs="Cambria" w:eastAsia="Cambria" w:hAnsi="Cambria"/>
+                <w:b/>
+                <w:bCs/>
+                <w:color w:val="333333"/>
+                <w:sz w:val="20"/>
+                <w:szCs w:val="20"/>
+              </w:rPr>
+              <w:t xml:space="preserve">0.00</w:t>
+            </w:r>
+          </w:p>
+        </w:tc>
+        <w:tc>
+          <w:tcPr>
+            <w:tcW w:type="dxa" w:w="1560"/>
+            <w:tcMar>
+              <w:top w:type="dxa" w:w="70"/>
+              <w:left w:type="dxa" w:w="100"/>
+              <w:bottom w:type="dxa" w:w="70"/>
+              <w:right w:type="dxa" w:w="100"/>
+            </w:tcMar>
+          </w:tcPr>
+          <w:p>
+            <w:pPr>
+              <w:spacing w:after="0"/>
+              <w:jc w:val="center"/>
+            </w:pPr>
+          </w:p>
+        </w:tc>
+        <w:tc>
+          <w:tcPr>
+            <w:tcW w:type="dxa" w:w="1560"/>
+            <w:tcMar>
+              <w:top w:type="dxa" w:w="70"/>
+              <w:left w:type="dxa" w:w="100"/>
+              <w:bottom w:type="dxa" w:w="70"/>
+              <w:right w:type="dxa" w:w="100"/>
+            </w:tcMar>
+          </w:tcPr>
+          <w:p>
+            <w:pPr>
+              <w:spacing w:after="0"/>
+              <w:jc w:val="center"/>
+            </w:pPr>
+            <w:r>
+              <w:rPr>
+                <w:rFonts w:ascii="Cambria" w:cs="Cambria" w:eastAsia="Cambria" w:hAnsi="Cambria"/>
+                <w:b/>
+                <w:bCs/>
+                <w:color w:val="333333"/>
+                <w:sz w:val="20"/>
+                <w:szCs w:val="20"/>
+              </w:rPr>
+              <w:t xml:space="preserve">0.40</w:t>
+            </w:r>
+          </w:p>
+        </w:tc>
+      </w:tr>
+      <w:tr>
+        <w:tc>
+          <w:tcPr>
+            <w:tcW w:type="dxa" w:w="3120"/>
+            <w:gridSpan w:val="2"/>
+            <w:shd w:fill="F0F5FA" w:color="auto" w:val="clear"/>
+            <w:tcMar>
+              <w:top w:type="dxa" w:w="70"/>
+              <w:left w:type="dxa" w:w="100"/>
+              <w:bottom w:type="dxa" w:w="70"/>
+              <w:right w:type="dxa" w:w="100"/>
+            </w:tcMar>
+          </w:tcPr>
+          <w:p>
+            <w:pPr>
+              <w:spacing w:after="0"/>
+              <w:jc w:val="left"/>
+            </w:pPr>
+            <w:r>
+              <w:rPr>
+                <w:rFonts w:ascii="Cambria" w:cs="Cambria" w:eastAsia="Cambria" w:hAnsi="Cambria"/>
+                <w:b/>
+                <w:bCs/>
+                <w:color w:val="333333"/>
+                <w:sz w:val="20"/>
+                <w:szCs w:val="20"/>
+              </w:rPr>
+              <w:t xml:space="preserve">Total muscle force</w:t>
+            </w:r>
+          </w:p>
+        </w:tc>
+        <w:tc>
+          <w:tcPr>
+            <w:tcW w:type="dxa" w:w="1560"/>
+            <w:shd w:fill="F0F5FA" w:color="auto" w:val="clear"/>
+            <w:tcMar>
+              <w:top w:type="dxa" w:w="70"/>
+              <w:left w:type="dxa" w:w="100"/>
+              <w:bottom w:type="dxa" w:w="70"/>
+              <w:right w:type="dxa" w:w="100"/>
+            </w:tcMar>
+          </w:tcPr>
+          <w:p>
+            <w:pPr>
+              <w:spacing w:after="0"/>
+              <w:jc w:val="center"/>
+            </w:pPr>
+            <w:r>
+              <w:rPr>
+                <w:rFonts w:ascii="Cambria" w:cs="Cambria" w:eastAsia="Cambria" w:hAnsi="Cambria"/>
+                <w:color w:val="333333"/>
+                <w:sz w:val="20"/>
+                <w:szCs w:val="20"/>
+              </w:rPr>
+              <w:t xml:space="preserve">40</w:t>
+            </w:r>
+          </w:p>
+        </w:tc>
+        <w:tc>
+          <w:tcPr>
+            <w:tcW w:type="dxa" w:w="1560"/>
+            <w:shd w:fill="F0F5FA" w:color="auto" w:val="clear"/>
+            <w:tcMar>
+              <w:top w:type="dxa" w:w="70"/>
+              <w:left w:type="dxa" w:w="100"/>
+              <w:bottom w:type="dxa" w:w="70"/>
+              <w:right w:type="dxa" w:w="100"/>
+            </w:tcMar>
+          </w:tcPr>
+          <w:p>
+            <w:pPr>
+              <w:spacing w:after="0"/>
+              <w:jc w:val="center"/>
+            </w:pPr>
+          </w:p>
+        </w:tc>
+        <w:tc>
+          <w:tcPr>
+            <w:tcW w:type="dxa" w:w="1560"/>
+            <w:shd w:fill="F0F5FA" w:color="auto" w:val="clear"/>
+            <w:tcMar>
+              <w:top w:type="dxa" w:w="70"/>
+              <w:left w:type="dxa" w:w="100"/>
+              <w:bottom w:type="dxa" w:w="70"/>
+              <w:right w:type="dxa" w:w="100"/>
+            </w:tcMar>
+          </w:tcPr>
+          <w:p>
+            <w:pPr>
+              <w:spacing w:after="0"/>
+              <w:jc w:val="center"/>
+            </w:pPr>
+            <w:r>
+              <w:rPr>
+                <w:rFonts w:ascii="Cambria" w:cs="Cambria" w:eastAsia="Cambria" w:hAnsi="Cambria"/>
+                <w:color w:val="333333"/>
+                <w:sz w:val="20"/>
+                <w:szCs w:val="20"/>
+              </w:rPr>
+              <w:t xml:space="preserve">60</w:t>
+            </w:r>
+          </w:p>
+        </w:tc>
+        <w:tc>
+          <w:tcPr>
+            <w:tcW w:type="dxa" w:w="1560"/>
+            <w:shd w:fill="F0F5FA" w:color="auto" w:val="clear"/>
+            <w:tcMar>
+              <w:top w:type="dxa" w:w="70"/>
+              <w:left w:type="dxa" w:w="100"/>
+              <w:bottom w:type="dxa" w:w="70"/>
+              <w:right w:type="dxa" w:w="100"/>
+            </w:tcMar>
+          </w:tcPr>
+          <w:p>
+            <w:pPr>
+              <w:spacing w:after="0"/>
+              <w:jc w:val="center"/>
+            </w:pPr>
+          </w:p>
+        </w:tc>
+      </w:tr>
+    </w:tbl>
+    <w:p>
+      <w:pPr>
+        <w:spacing w:after="140" w:before="180" w:line="276"/>
+      </w:pPr>
+      <w:r>
+        <w:rPr>
+          <w:rFonts w:ascii="Cambria" w:cs="Cambria" w:eastAsia="Cambria" w:hAnsi="Cambria"/>
+          <w:color w:val="333333"/>
+          <w:sz w:val="22"/>
+          <w:szCs w:val="22"/>
+        </w:rPr>
+        <w:t xml:space="preserve">Read each torque column from top to bottom. In F</w:t>
+      </w:r>
+      <w:r>
+        <w:rPr>
+          <w:rFonts w:ascii="Cambria" w:cs="Cambria" w:eastAsia="Cambria" w:hAnsi="Cambria"/>
+          <w:color w:val="333333"/>
+          <w:sz w:val="22"/>
+          <w:szCs w:val="22"/>
+          <w:vertAlign w:val="subscript"/>
+        </w:rPr>
+        <w:t xml:space="preserve">A</w:t>
+      </w:r>
+      <w:r>
+        <w:rPr>
+          <w:rFonts w:ascii="Cambria" w:cs="Cambria" w:eastAsia="Cambria" w:hAnsi="Cambria"/>
+          <w:color w:val="333333"/>
+          <w:sz w:val="22"/>
+          <w:szCs w:val="22"/>
+        </w:rPr>
+        <w:t xml:space="preserve">, delt and tri_lg both pull toward extension and nothing pulls the other way, so the whole −1.60 N·m moves the arm. In F</w:t>
+      </w:r>
+      <w:r>
+        <w:rPr>
+          <w:rFonts w:ascii="Cambria" w:cs="Cambria" w:eastAsia="Cambria" w:hAnsi="Cambria"/>
+          <w:color w:val="333333"/>
+          <w:sz w:val="22"/>
+          <w:szCs w:val="22"/>
+          <w:vertAlign w:val="subscript"/>
+        </w:rPr>
+        <w:t xml:space="preserve">B</w:t>
+      </w:r>
+      <w:r>
+        <w:rPr>
+          <w:rFonts w:ascii="Cambria" w:cs="Cambria" w:eastAsia="Cambria" w:hAnsi="Cambria"/>
+          <w:color w:val="333333"/>
+          <w:sz w:val="22"/>
+          <w:szCs w:val="22"/>
+        </w:rPr>
+        <w:t xml:space="preserve">, pec adds +0.40 N·m of flexion, and the extra 10 N in delt adds −0.40 N·m of extension. The extensors now produce −2.00 N·m. Of that, 0.40 N·m only cancels pec, and the remaining −1.60 N·m moves the arm.</w:t>
+      </w:r>
+    </w:p>
+    <w:p>
+      <w:pPr>
+        <w:spacing w:after="140" w:before="0" w:line="276"/>
+      </w:pPr>
+      <w:r>
+        <w:rPr>
+          <w:rFonts w:ascii="Cambria" w:cs="Cambria" w:eastAsia="Cambria" w:hAnsi="Cambria"/>
+          <w:color w:val="333333"/>
+          <w:sz w:val="22"/>
+          <w:szCs w:val="22"/>
+        </w:rPr>
+        <w:t xml:space="preserve">Co-contraction is the torque canceled in this way. It equals the smaller of the flexor and extensor totals, ignoring sign: 0 in F</w:t>
+      </w:r>
+      <w:r>
+        <w:rPr>
+          <w:rFonts w:ascii="Cambria" w:cs="Cambria" w:eastAsia="Cambria" w:hAnsi="Cambria"/>
+          <w:color w:val="333333"/>
+          <w:sz w:val="22"/>
+          <w:szCs w:val="22"/>
+          <w:vertAlign w:val="subscript"/>
+        </w:rPr>
+        <w:t xml:space="preserve">A</w:t>
+      </w:r>
+      <w:r>
+        <w:rPr>
+          <w:rFonts w:ascii="Cambria" w:cs="Cambria" w:eastAsia="Cambria" w:hAnsi="Cambria"/>
+          <w:color w:val="333333"/>
+          <w:sz w:val="22"/>
+          <w:szCs w:val="22"/>
+        </w:rPr>
+        <w:t xml:space="preserve"> and 0.40 N·m in F</w:t>
+      </w:r>
+      <w:r>
+        <w:rPr>
+          <w:rFonts w:ascii="Cambria" w:cs="Cambria" w:eastAsia="Cambria" w:hAnsi="Cambria"/>
+          <w:color w:val="333333"/>
+          <w:sz w:val="22"/>
+          <w:szCs w:val="22"/>
+          <w:vertAlign w:val="subscript"/>
+        </w:rPr>
+        <w:t xml:space="preserve">B</w:t>
+      </w:r>
+      <w:r>
+        <w:rPr>
+          <w:rFonts w:ascii="Cambria" w:cs="Cambria" w:eastAsia="Cambria" w:hAnsi="Cambria"/>
+          <w:color w:val="333333"/>
+          <w:sz w:val="22"/>
+          <w:szCs w:val="22"/>
+        </w:rPr>
+        <w:t xml:space="preserve">. The net shoulder torque is −1.60 N·m in both. At the elbow, only tri_lg contributes in either vector (10 N × −0.02 m = −0.20 N·m). Both joints receive the same net torque, so the arm makes the same movement.</w:t>
+      </w:r>
+    </w:p>
+    <w:p>
+      <w:pPr>
+        <w:spacing w:after="140" w:before="0" w:line="276"/>
+      </w:pPr>
+      <w:r>
+        <w:rPr>
+          <w:rFonts w:ascii="Cambria" w:cs="Cambria" w:eastAsia="Cambria" w:hAnsi="Cambria"/>
+          <w:color w:val="333333"/>
+          <w:sz w:val="22"/>
+          <w:szCs w:val="22"/>
+        </w:rPr>
+        <w:t xml:space="preserve">The difference between the two vectors, F</w:t>
+      </w:r>
+      <w:r>
+        <w:rPr>
+          <w:rFonts w:ascii="Cambria" w:cs="Cambria" w:eastAsia="Cambria" w:hAnsi="Cambria"/>
+          <w:color w:val="333333"/>
+          <w:sz w:val="22"/>
+          <w:szCs w:val="22"/>
+          <w:vertAlign w:val="subscript"/>
+        </w:rPr>
+        <w:t xml:space="preserve">B</w:t>
+      </w:r>
+      <w:r>
+        <w:rPr>
+          <w:rFonts w:ascii="Cambria" w:cs="Cambria" w:eastAsia="Cambria" w:hAnsi="Cambria"/>
+          <w:color w:val="333333"/>
+          <w:sz w:val="22"/>
+          <w:szCs w:val="22"/>
+        </w:rPr>
+        <w:t xml:space="preserve"> − F</w:t>
+      </w:r>
+      <w:r>
+        <w:rPr>
+          <w:rFonts w:ascii="Cambria" w:cs="Cambria" w:eastAsia="Cambria" w:hAnsi="Cambria"/>
+          <w:color w:val="333333"/>
+          <w:sz w:val="22"/>
+          <w:szCs w:val="22"/>
+          <w:vertAlign w:val="subscript"/>
+        </w:rPr>
+        <w:t xml:space="preserve">A</w:t>
+      </w:r>
+      <w:r>
+        <w:rPr>
+          <w:rFonts w:ascii="Cambria" w:cs="Cambria" w:eastAsia="Cambria" w:hAnsi="Cambria"/>
+          <w:color w:val="333333"/>
+          <w:sz w:val="22"/>
+          <w:szCs w:val="22"/>
+        </w:rPr>
+        <w:t xml:space="preserve"> = (10, 0, 0, 10, 0, 0) N, is the equal pec and delt pair from the start of this section. It adds +0.40 N·m and −0.40 N·m at the shoulder and nothing at the elbow, so it lies in the null space of R. Adding it left the net torque unchanged. It raised the co-contraction from 0 to 0.40 N·m and the total muscle force from 40 N to 60 N.</w:t>
       </w:r>
     </w:p>
     <w:p>
@@ -1895,6 +3459,7 @@
     </w:p>
     <w:p>
       <w:pPr>
+        <w:keepNext/>
         <w:spacing w:after="160" w:before="340"/>
       </w:pPr>
       <w:r>
@@ -1952,6 +3517,7 @@
     </w:p>
     <w:p>
       <w:pPr>
+        <w:keepNext/>
         <w:spacing w:after="130" w:before="280"/>
       </w:pPr>
       <w:r>
@@ -1996,6 +3562,7 @@
     </w:p>
     <w:p>
       <w:pPr>
+        <w:keepNext/>
         <w:spacing w:after="90" w:before="200"/>
         <w:jc w:val="center"/>
       </w:pPr>
@@ -2069,6 +3636,7 @@
     </w:p>
     <w:p>
       <w:pPr>
+        <w:keepNext/>
         <w:spacing w:after="130" w:before="280"/>
       </w:pPr>
       <w:r>
@@ -2127,6 +3695,7 @@
     </w:p>
     <w:p>
       <w:pPr>
+        <w:keepNext/>
         <w:spacing w:after="130" w:before="280"/>
       </w:pPr>
       <w:r>
@@ -2199,6 +3768,7 @@
     </w:p>
     <w:p>
       <w:pPr>
+        <w:keepNext/>
         <w:spacing w:after="160" w:before="340"/>
       </w:pPr>
       <w:r>
@@ -2789,6 +4359,7 @@
     </w:p>
     <w:p>
       <w:pPr>
+        <w:keepNext/>
         <w:spacing w:after="130" w:before="280"/>
       </w:pPr>
       <w:r>
@@ -2860,6 +4431,7 @@
     </w:p>
     <w:p>
       <w:pPr>
+        <w:keepNext/>
         <w:spacing w:after="130" w:before="280"/>
       </w:pPr>
       <w:r>
@@ -2959,6 +4531,7 @@
     </w:p>
     <w:p>
       <w:pPr>
+        <w:keepNext/>
         <w:spacing w:after="130" w:before="280"/>
       </w:pPr>
       <w:r>
@@ -3071,6 +4644,7 @@
     </w:p>
     <w:p>
       <w:pPr>
+        <w:keepNext/>
         <w:spacing w:after="90" w:before="200"/>
         <w:jc w:val="center"/>
       </w:pPr>
@@ -3144,6 +4718,7 @@
     </w:p>
     <w:p>
       <w:pPr>
+        <w:keepNext/>
         <w:spacing w:after="130" w:before="280"/>
       </w:pPr>
       <w:r>
@@ -3229,6 +4804,7 @@
           </w:tcPr>
           <w:p>
             <w:pPr>
+              <w:keepNext/>
               <w:spacing w:after="90"/>
             </w:pPr>
             <w:r>
@@ -3262,6 +4838,7 @@
     </w:tbl>
     <w:p>
       <w:pPr>
+        <w:keepNext/>
         <w:spacing w:after="160" w:before="340"/>
       </w:pPr>
       <w:r>
@@ -3292,6 +4869,7 @@
     </w:p>
     <w:p>
       <w:pPr>
+        <w:keepNext/>
         <w:spacing w:after="90" w:before="200"/>
         <w:jc w:val="center"/>
       </w:pPr>
@@ -3434,6 +5012,7 @@
           </w:tcPr>
           <w:p>
             <w:pPr>
+              <w:keepNext/>
               <w:spacing w:after="90"/>
             </w:pPr>
             <w:r>
@@ -3481,6 +5060,7 @@
     </w:tbl>
     <w:p>
       <w:pPr>
+        <w:keepNext/>
         <w:spacing w:after="160" w:before="340"/>
       </w:pPr>
       <w:r>
@@ -3525,6 +5105,7 @@
     </w:p>
     <w:p>
       <w:pPr>
+        <w:keepNext/>
         <w:spacing w:after="90" w:before="200"/>
         <w:jc w:val="center"/>
       </w:pPr>
@@ -3598,6 +5179,7 @@
     </w:p>
     <w:p>
       <w:pPr>
+        <w:keepNext/>
         <w:spacing w:after="130" w:before="280"/>
       </w:pPr>
       <w:r>
@@ -3684,6 +5266,7 @@
     </w:p>
     <w:p>
       <w:pPr>
+        <w:keepNext/>
         <w:spacing w:after="130" w:before="280"/>
       </w:pPr>
       <w:r>
@@ -3741,6 +5324,7 @@
           </w:tcPr>
           <w:p>
             <w:pPr>
+              <w:keepNext/>
               <w:spacing w:after="90"/>
             </w:pPr>
             <w:r>
@@ -3774,6 +5358,7 @@
     </w:tbl>
     <w:p>
       <w:pPr>
+        <w:keepNext/>
         <w:spacing w:after="160" w:before="340"/>
       </w:pPr>
       <w:r>
@@ -3846,6 +5431,7 @@
     </w:p>
     <w:p>
       <w:pPr>
+        <w:keepNext/>
         <w:spacing w:after="160" w:before="340"/>
       </w:pPr>
       <w:r>

</xml_diff>

<commit_message>
W6&7 materials updated Oct 27th 2026
</commit_message>
<xml_diff>
--- a/lectures/week06/Week6_Lecture.docx
+++ b/lectures/week06/Week6_Lecture.docx
@@ -516,6 +516,20 @@
         </w:tc>
       </w:tr>
     </w:tbl>
+    <w:p>
+      <w:pPr>
+        <w:spacing w:after="140" w:before="180" w:line="276"/>
+      </w:pPr>
+      <w:r>
+        <w:rPr>
+          <w:rFonts w:ascii="Cambria" w:cs="Cambria" w:eastAsia="Cambria" w:hAnsi="Cambria"/>
+          <w:color w:val="333333"/>
+          <w:sz w:val="22"/>
+          <w:szCs w:val="22"/>
+        </w:rPr>
+        <w:t xml:space="preserve">Figure 1 lays out the computation of the week in five steps, from the planned hand path to the muscle activations, with the equations each step uses.</w:t>
+      </w:r>
+    </w:p>
     <w:p>
       <w:pPr>
         <w:keepNext/>
@@ -650,7 +664,7 @@
           <w:sz w:val="22"/>
           <w:szCs w:val="22"/>
         </w:rPr>
-        <w:t xml:space="preserve">The plan is a Cartesian path P(t). The plant accepts joint torques. Getting from one to the other is a fixed sequence of steps, and each is worth naming because each introduces its own error.</w:t>
+        <w:t xml:space="preserve">The plan is a Cartesian path P(t). The plant accepts joint torques. Getting from one to the other is a fixed sequence of steps, and each is worth naming because each introduces its own error. The steps below are numbered as in Figure 1, and Figure 2 follows them through the 135° reach.</w:t>
       </w:r>
     </w:p>
     <w:p>
@@ -664,7 +678,7 @@
           <wp:inline distT="0" distB="0" distL="0" distR="0">
             <wp:extent cx="5715000" cy="3028950"/>
             <wp:effectExtent t="0" r="0" b="0" l="0"/>
-            <wp:docPr id="1" name="" descr="" title=""/>
+            <wp:docPr id="2" name="" descr="" title=""/>
             <wp:cNvGraphicFramePr>
               <a:graphicFrameLocks xmlns:a="http://schemas.openxmlformats.org/drawingml/2006/main" noChangeAspect="1"/>
             </wp:cNvGraphicFramePr>
@@ -739,35 +753,35 @@
           <w:sz w:val="22"/>
           <w:szCs w:val="22"/>
         </w:rPr>
-        <w:t xml:space="preserve">Step 1 — The plan. A minimum-jerk straight line, P(t), sampled every 1 ms. It exists only in hand coordinates and knows nothing about the arm.</w:t>
-      </w:r>
-    </w:p>
-    <w:p>
-      <w:pPr>
-        <w:spacing w:after="140" w:before="0" w:line="276"/>
-      </w:pPr>
-      <w:r>
-        <w:rPr>
-          <w:rFonts w:ascii="Cambria" w:cs="Cambria" w:eastAsia="Cambria" w:hAnsi="Cambria"/>
-          <w:color w:val="333333"/>
-          <w:sz w:val="22"/>
-          <w:szCs w:val="22"/>
-        </w:rPr>
-        <w:t xml:space="preserve">Step 2 — Inverse kinematics. Apply the Week 1 inverse kinematics at every sample to get q(t). Note what happens to the shape of the trajectory: the hand path is a straight line with a symmetric bell-shaped speed profile, but the joint trajectory is its image under a nonlinear map and inherits neither property exactly.</w:t>
-      </w:r>
-    </w:p>
-    <w:p>
-      <w:pPr>
-        <w:spacing w:after="140" w:before="0" w:line="276"/>
-      </w:pPr>
-      <w:r>
-        <w:rPr>
-          <w:rFonts w:ascii="Cambria" w:cs="Cambria" w:eastAsia="Cambria" w:hAnsi="Cambria"/>
-          <w:color w:val="333333"/>
-          <w:sz w:val="22"/>
-          <w:szCs w:val="22"/>
-        </w:rPr>
-        <w:t xml:space="preserve">Step 3 — Differentiation. Central differences give q̇(t) and q̈(t) (Figure 2C). Because the minimum-jerk polynomial is smooth, no filtering is needed — but the step size is a real choice, and §5 returns to it.</w:t>
+        <w:t xml:space="preserve">The plan. A minimum-jerk straight line, P(t), sampled every 1 ms (Figure 2A). It exists only in hand coordinates and knows nothing about the arm.</w:t>
+      </w:r>
+    </w:p>
+    <w:p>
+      <w:pPr>
+        <w:spacing w:after="140" w:before="0" w:line="276"/>
+      </w:pPr>
+      <w:r>
+        <w:rPr>
+          <w:rFonts w:ascii="Cambria" w:cs="Cambria" w:eastAsia="Cambria" w:hAnsi="Cambria"/>
+          <w:color w:val="333333"/>
+          <w:sz w:val="22"/>
+          <w:szCs w:val="22"/>
+        </w:rPr>
+        <w:t xml:space="preserve">Step 1 — Inverse kinematics. Apply the Week 1 inverse kinematics at every sample to get q(t) (Figure 2B). Note what happens to the shape of the trajectory: the hand path is a straight line with a symmetric bell-shaped speed profile, but the joint trajectory is its image under a nonlinear map and inherits neither property exactly.</w:t>
+      </w:r>
+    </w:p>
+    <w:p>
+      <w:pPr>
+        <w:spacing w:after="140" w:before="0" w:line="276"/>
+      </w:pPr>
+      <w:r>
+        <w:rPr>
+          <w:rFonts w:ascii="Cambria" w:cs="Cambria" w:eastAsia="Cambria" w:hAnsi="Cambria"/>
+          <w:color w:val="333333"/>
+          <w:sz w:val="22"/>
+          <w:szCs w:val="22"/>
+        </w:rPr>
+        <w:t xml:space="preserve">Step 2 — Differentiation. Central differences give q̇(t) and q̈(t) (Figure 2C). Because the minimum-jerk polynomial is smooth, no filtering is needed — but the step size is a real choice, and §9 returns to it.</w:t>
       </w:r>
     </w:p>
     <w:p>
@@ -795,21 +809,21 @@
           <w:sz w:val="22"/>
           <w:szCs w:val="22"/>
         </w:rPr>
-        <w:t xml:space="preserve">Steps 4 and 5 — Torques. Evaluate M(q)·q̈ and C(q, q̇)·q̇ at every sample using the Week 3 expressions and add them. This is the answer: at the joint level the inverse problem has exactly one solution, because M(q) is invertible everywhere in the workspace.</w:t>
-      </w:r>
-    </w:p>
-    <w:p>
-      <w:pPr>
-        <w:spacing w:after="140" w:before="0" w:line="276"/>
-      </w:pPr>
-      <w:r>
-        <w:rPr>
-          <w:rFonts w:ascii="Cambria" w:cs="Cambria" w:eastAsia="Cambria" w:hAnsi="Cambria"/>
-          <w:color w:val="333333"/>
-          <w:sz w:val="22"/>
-          <w:szCs w:val="22"/>
-        </w:rPr>
-        <w:t xml:space="preserve">Step 6 — Verification. Feed the computed torques into the forward simulator from Week 3 and check that the arm actually goes where it was supposed to. On the 135° reach the executed path deviates from the plan by 0.0002 cm — for practical purposes, exact. This step is not optional. An inverse dynamics pipeline that is silently wrong produces torques that look plausible and movements that are not, and forward simulation is the only thing that catches it.</w:t>
+        <w:t xml:space="preserve">Step 3 — Torques. Evaluate M(q)·q̈ and c(q, q̇) at every sample using the Week 3 expressions and add them (Figure 2D and 2E). This is the answer: at the joint level the inverse problem has exactly one solution, because M(q) is invertible everywhere in the workspace. Steps 4 and 5 of Figure 1 take this torque down to the muscles; §4 to §6 cover them.</w:t>
+      </w:r>
+    </w:p>
+    <w:p>
+      <w:pPr>
+        <w:spacing w:after="140" w:before="0" w:line="276"/>
+      </w:pPr>
+      <w:r>
+        <w:rPr>
+          <w:rFonts w:ascii="Cambria" w:cs="Cambria" w:eastAsia="Cambria" w:hAnsi="Cambria"/>
+          <w:color w:val="333333"/>
+          <w:sz w:val="22"/>
+          <w:szCs w:val="22"/>
+        </w:rPr>
+        <w:t xml:space="preserve">Verification. Feed the computed torques into the forward simulator from Week 3 and check that the arm actually goes where it was supposed to. On the 135° reach the executed path deviates from the plan by 0.0002 cm (Figure 2F) — for practical purposes, exact. This step is not optional. An inverse dynamics pipeline that is silently wrong produces torques that look plausible and movements that are not, and forward simulation is the only thing that catches it.</w:t>
       </w:r>
     </w:p>
     <w:tbl>
@@ -875,6 +889,292 @@
     </w:tbl>
     <w:p>
       <w:pPr>
+        <w:spacing w:after="140" w:before="180" w:line="276"/>
+      </w:pPr>
+      <w:r>
+        <w:rPr>
+          <w:rFonts w:ascii="Cambria" w:cs="Cambria" w:eastAsia="Cambria" w:hAnsi="Cambria"/>
+          <w:color w:val="333333"/>
+          <w:sz w:val="22"/>
+          <w:szCs w:val="22"/>
+        </w:rPr>
+        <w:t xml:space="preserve">Figure 3 draws the whole controller of this week. The top row is what runs. Week 1’s inverse kinematics turns the plan into joint angles, central differences give their velocities and accelerations, and inverse dynamics turns these into the torque τ</w:t>
+      </w:r>
+      <w:r>
+        <w:rPr>
+          <w:rFonts w:ascii="Cambria" w:cs="Cambria" w:eastAsia="Cambria" w:hAnsi="Cambria"/>
+          <w:color w:val="333333"/>
+          <w:sz w:val="22"/>
+          <w:szCs w:val="22"/>
+          <w:vertAlign w:val="subscript"/>
+        </w:rPr>
+        <w:t xml:space="preserve">ff</w:t>
+      </w:r>
+      <w:r>
+        <w:rPr>
+          <w:rFonts w:ascii="Cambria" w:cs="Cambria" w:eastAsia="Cambria" w:hAnsi="Cambria"/>
+          <w:color w:val="333333"/>
+          <w:sz w:val="22"/>
+          <w:szCs w:val="22"/>
+        </w:rPr>
+        <w:t xml:space="preserve">. Week 3’s arm executes τ</w:t>
+      </w:r>
+      <w:r>
+        <w:rPr>
+          <w:rFonts w:ascii="Cambria" w:cs="Cambria" w:eastAsia="Cambria" w:hAnsi="Cambria"/>
+          <w:color w:val="333333"/>
+          <w:sz w:val="22"/>
+          <w:szCs w:val="22"/>
+          <w:vertAlign w:val="subscript"/>
+        </w:rPr>
+        <w:t xml:space="preserve">ff</w:t>
+      </w:r>
+      <w:r>
+        <w:rPr>
+          <w:rFonts w:ascii="Cambria" w:cs="Cambria" w:eastAsia="Cambria" w:hAnsi="Cambria"/>
+          <w:color w:val="333333"/>
+          <w:sz w:val="22"/>
+          <w:szCs w:val="22"/>
+        </w:rPr>
+        <w:t xml:space="preserve">, and the hand follows the plan. From §3 on, a 3 N load also acts on the hand, and inverse dynamics includes the torque that holds it.</w:t>
+      </w:r>
+    </w:p>
+    <w:p>
+      <w:pPr>
+        <w:spacing w:after="140" w:before="0" w:line="276"/>
+      </w:pPr>
+      <w:r>
+        <w:rPr>
+          <w:rFonts w:ascii="Cambria" w:cs="Cambria" w:eastAsia="Cambria" w:hAnsi="Cambria"/>
+          <w:color w:val="333333"/>
+          <w:sz w:val="22"/>
+          <w:szCs w:val="22"/>
+        </w:rPr>
+        <w:t xml:space="preserve">The bottom row starts from the same τ</w:t>
+      </w:r>
+      <w:r>
+        <w:rPr>
+          <w:rFonts w:ascii="Cambria" w:cs="Cambria" w:eastAsia="Cambria" w:hAnsi="Cambria"/>
+          <w:color w:val="333333"/>
+          <w:sz w:val="22"/>
+          <w:szCs w:val="22"/>
+          <w:vertAlign w:val="subscript"/>
+        </w:rPr>
+        <w:t xml:space="preserve">ff</w:t>
+      </w:r>
+      <w:r>
+        <w:rPr>
+          <w:rFonts w:ascii="Cambria" w:cs="Cambria" w:eastAsia="Cambria" w:hAnsi="Cambria"/>
+          <w:color w:val="333333"/>
+          <w:sz w:val="22"/>
+          <w:szCs w:val="22"/>
+        </w:rPr>
+        <w:t xml:space="preserve"> but is never executed. §4 and §5 divide τ</w:t>
+      </w:r>
+      <w:r>
+        <w:rPr>
+          <w:rFonts w:ascii="Cambria" w:cs="Cambria" w:eastAsia="Cambria" w:hAnsi="Cambria"/>
+          <w:color w:val="333333"/>
+          <w:sz w:val="22"/>
+          <w:szCs w:val="22"/>
+          <w:vertAlign w:val="subscript"/>
+        </w:rPr>
+        <w:t xml:space="preserve">ff</w:t>
+      </w:r>
+      <w:r>
+        <w:rPr>
+          <w:rFonts w:ascii="Cambria" w:cs="Cambria" w:eastAsia="Cambria" w:hAnsi="Cambria"/>
+          <w:color w:val="333333"/>
+          <w:sz w:val="22"/>
+          <w:szCs w:val="22"/>
+        </w:rPr>
+        <w:t xml:space="preserve"> among six muscles, and §6 runs Week 2’s muscle model backwards to find the activations those muscles would need. The activations test whether the movement is possible. Nothing measured returns from the hand to the controller: τ</w:t>
+      </w:r>
+      <w:r>
+        <w:rPr>
+          <w:rFonts w:ascii="Cambria" w:cs="Cambria" w:eastAsia="Cambria" w:hAnsi="Cambria"/>
+          <w:color w:val="333333"/>
+          <w:sz w:val="22"/>
+          <w:szCs w:val="22"/>
+          <w:vertAlign w:val="subscript"/>
+        </w:rPr>
+        <w:t xml:space="preserve">ff</w:t>
+      </w:r>
+      <w:r>
+        <w:rPr>
+          <w:rFonts w:ascii="Cambria" w:cs="Cambria" w:eastAsia="Cambria" w:hAnsi="Cambria"/>
+          <w:color w:val="333333"/>
+          <w:sz w:val="22"/>
+          <w:szCs w:val="22"/>
+        </w:rPr>
+        <w:t xml:space="preserve"> is computed before the movement starts, and nothing corrects it while the arm moves. Week 7 adds noise to τ</w:t>
+      </w:r>
+      <w:r>
+        <w:rPr>
+          <w:rFonts w:ascii="Cambria" w:cs="Cambria" w:eastAsia="Cambria" w:hAnsi="Cambria"/>
+          <w:color w:val="333333"/>
+          <w:sz w:val="22"/>
+          <w:szCs w:val="22"/>
+          <w:vertAlign w:val="subscript"/>
+        </w:rPr>
+        <w:t xml:space="preserve">ff</w:t>
+      </w:r>
+      <w:r>
+        <w:rPr>
+          <w:rFonts w:ascii="Cambria" w:cs="Cambria" w:eastAsia="Cambria" w:hAnsi="Cambria"/>
+          <w:color w:val="333333"/>
+          <w:sz w:val="22"/>
+          <w:szCs w:val="22"/>
+        </w:rPr>
+        <w:t xml:space="preserve">, and Week 8 adds a sensor.</w:t>
+      </w:r>
+    </w:p>
+    <w:p>
+      <w:pPr>
+        <w:keepNext/>
+        <w:spacing w:after="90" w:before="200"/>
+        <w:jc w:val="center"/>
+      </w:pPr>
+      <w:r>
+        <w:drawing>
+          <wp:inline distT="0" distB="0" distL="0" distR="0">
+            <wp:extent cx="5715000" cy="4027915"/>
+            <wp:effectExtent t="0" r="0" b="0" l="0"/>
+            <wp:docPr id="3" name="" descr="" title=""/>
+            <wp:cNvGraphicFramePr>
+              <a:graphicFrameLocks xmlns:a="http://schemas.openxmlformats.org/drawingml/2006/main" noChangeAspect="1"/>
+            </wp:cNvGraphicFramePr>
+            <a:graphic xmlns:a="http://schemas.openxmlformats.org/drawingml/2006/main">
+              <a:graphicData uri="http://schemas.openxmlformats.org/drawingml/2006/picture">
+                <pic:pic xmlns:pic="http://schemas.openxmlformats.org/drawingml/2006/picture">
+                  <pic:nvPicPr>
+                    <pic:cNvPr id="0" name="" descr=""/>
+                    <pic:cNvPicPr>
+                      <a:picLocks noChangeAspect="1" noChangeArrowheads="1"/>
+                    </pic:cNvPicPr>
+                  </pic:nvPicPr>
+                  <pic:blipFill>
+                    <a:blip r:embed="rId100" cstate="none"/>
+                    <a:srcRect/>
+                    <a:stretch>
+                      <a:fillRect/>
+                    </a:stretch>
+                  </pic:blipFill>
+                  <pic:spPr bwMode="auto">
+                    <a:xfrm>
+                      <a:off x="0" y="0"/>
+                      <a:ext cx="5715000" cy="4027915"/>
+                    </a:xfrm>
+                    <a:prstGeom prst="rect">
+                      <a:avLst/>
+                    </a:prstGeom>
+                  </pic:spPr>
+                </pic:pic>
+              </a:graphicData>
+            </a:graphic>
+          </wp:inline>
+        </w:drawing>
+      </w:r>
+    </w:p>
+    <w:p>
+      <w:pPr>
+        <w:keepLines/>
+        <w:spacing w:after="200" w:line="264"/>
+      </w:pPr>
+      <w:r>
+        <w:rPr>
+          <w:rFonts w:ascii="Cambria" w:cs="Cambria" w:eastAsia="Cambria" w:hAnsi="Cambria"/>
+          <w:b/>
+          <w:bCs/>
+          <w:color w:val="333333"/>
+          <w:sz w:val="19"/>
+          <w:szCs w:val="19"/>
+        </w:rPr>
+        <w:t xml:space="preserve">Figure 3. </w:t>
+      </w:r>
+      <w:r>
+        <w:rPr>
+          <w:rFonts w:ascii="Cambria" w:cs="Cambria" w:eastAsia="Cambria" w:hAnsi="Cambria"/>
+          <w:i/>
+          <w:iCs/>
+          <w:color w:val="333333"/>
+          <w:sz w:val="19"/>
+          <w:szCs w:val="19"/>
+        </w:rPr>
+        <w:t xml:space="preserve">The controller of this week. Colors give the week each part comes from. Top: what runs. Inverse kinematics, central differences and inverse dynamics turn Week 5’s minimum-jerk plan into the torque τ</w:t>
+      </w:r>
+      <w:r>
+        <w:rPr>
+          <w:rFonts w:ascii="Cambria" w:cs="Cambria" w:eastAsia="Cambria" w:hAnsi="Cambria"/>
+          <w:i/>
+          <w:iCs/>
+          <w:color w:val="333333"/>
+          <w:sz w:val="19"/>
+          <w:szCs w:val="19"/>
+          <w:vertAlign w:val="subscript"/>
+        </w:rPr>
+        <w:t xml:space="preserve">ff</w:t>
+      </w:r>
+      <w:r>
+        <w:rPr>
+          <w:rFonts w:ascii="Cambria" w:cs="Cambria" w:eastAsia="Cambria" w:hAnsi="Cambria"/>
+          <w:i/>
+          <w:iCs/>
+          <w:color w:val="333333"/>
+          <w:sz w:val="19"/>
+          <w:szCs w:val="19"/>
+        </w:rPr>
+        <w:t xml:space="preserve">, which Week 3’s arm executes. From §3 on, a 3 N load F acts on the hand, and the controller knows it exactly. Bottom: computed from τ</w:t>
+      </w:r>
+      <w:r>
+        <w:rPr>
+          <w:rFonts w:ascii="Cambria" w:cs="Cambria" w:eastAsia="Cambria" w:hAnsi="Cambria"/>
+          <w:i/>
+          <w:iCs/>
+          <w:color w:val="333333"/>
+          <w:sz w:val="19"/>
+          <w:szCs w:val="19"/>
+          <w:vertAlign w:val="subscript"/>
+        </w:rPr>
+        <w:t xml:space="preserve">ff</w:t>
+      </w:r>
+      <w:r>
+        <w:rPr>
+          <w:rFonts w:ascii="Cambria" w:cs="Cambria" w:eastAsia="Cambria" w:hAnsi="Cambria"/>
+          <w:i/>
+          <w:iCs/>
+          <w:color w:val="333333"/>
+          <w:sz w:val="19"/>
+          <w:szCs w:val="19"/>
+        </w:rPr>
+        <w:t xml:space="preserve"> but never executed. Static optimization (§5) divides τ</w:t>
+      </w:r>
+      <w:r>
+        <w:rPr>
+          <w:rFonts w:ascii="Cambria" w:cs="Cambria" w:eastAsia="Cambria" w:hAnsi="Cambria"/>
+          <w:i/>
+          <w:iCs/>
+          <w:color w:val="333333"/>
+          <w:sz w:val="19"/>
+          <w:szCs w:val="19"/>
+          <w:vertAlign w:val="subscript"/>
+        </w:rPr>
+        <w:t xml:space="preserve">ff</w:t>
+      </w:r>
+      <w:r>
+        <w:rPr>
+          <w:rFonts w:ascii="Cambria" w:cs="Cambria" w:eastAsia="Cambria" w:hAnsi="Cambria"/>
+          <w:i/>
+          <w:iCs/>
+          <w:color w:val="333333"/>
+          <w:sz w:val="19"/>
+          <w:szCs w:val="19"/>
+        </w:rPr>
+        <w:t xml:space="preserve"> among the six muscles, and Week 2’s muscle model, run backwards (§6), gives their activations. Any activation above 1 makes the movement impossible (§6.4). There is no sensor. In the top boxes, c stands for the Coriolis torque c(q, q̇). In the Week 2 box, M is a muscle’s contractile force and c is Week 2’s recruitment gradient.</w:t>
+      </w:r>
+    </w:p>
+    <w:p>
+      <w:pPr>
         <w:keepNext/>
         <w:spacing w:after="160" w:before="340"/>
       </w:pPr>
@@ -901,7 +1201,7 @@
           <w:sz w:val="22"/>
           <w:szCs w:val="22"/>
         </w:rPr>
-        <w:t xml:space="preserve">Run the pipeline for all eight directions and one number stands out. Peak inertial torque ranges from 0.25 N·m at 45° to 1.53 N·m at 135° — a factor of 6.1 — for movements of identical distance and identical duration.</w:t>
+        <w:t xml:space="preserve">Run the pipeline for all eight directions and one number stands out. Peak inertial torque ranges from 0.25 N·m at 45° to 1.53 N·m at 135° — a factor of 6.1 — for movements of identical distance and identical duration. Figure 4B shows all eight peaks.</w:t>
       </w:r>
     </w:p>
     <w:p>
@@ -915,7 +1215,7 @@
           <wp:inline distT="0" distB="0" distL="0" distR="0">
             <wp:extent cx="5715000" cy="1743075"/>
             <wp:effectExtent t="0" r="0" b="0" l="0"/>
-            <wp:docPr id="1" name="" descr="" title=""/>
+            <wp:docPr id="4" name="" descr="" title=""/>
             <wp:cNvGraphicFramePr>
               <a:graphicFrameLocks xmlns:a="http://schemas.openxmlformats.org/drawingml/2006/main" noChangeAspect="1"/>
             </wp:cNvGraphicFramePr>
@@ -965,7 +1265,7 @@
           <w:sz w:val="19"/>
           <w:szCs w:val="19"/>
         </w:rPr>
-        <w:t xml:space="preserve">Figure 3. </w:t>
+        <w:t xml:space="preserve">Figure 4. </w:t>
       </w:r>
       <w:r>
         <w:rPr>
@@ -1131,21 +1431,21 @@
           <w:sz w:val="22"/>
           <w:szCs w:val="22"/>
         </w:rPr>
-        <w:t xml:space="preserve">At the start posture Λ has eigenvalues of 0.30 kg and 2.09 kg, an anisotropy of 6.9, with the light axis pointing along 42° and the heavy axis along 132°. Figure 3A draws it. The ellipse is nearly a needle, and it is aimed almost exactly at the 135° and 315° targets while its narrow direction points at 45° and 225°.</w:t>
-      </w:r>
-    </w:p>
-    <w:p>
-      <w:pPr>
-        <w:spacing w:after="140" w:before="0" w:line="276"/>
-      </w:pPr>
-      <w:r>
-        <w:rPr>
-          <w:rFonts w:ascii="Cambria" w:cs="Cambria" w:eastAsia="Cambria" w:hAnsi="Cambria"/>
-          <w:color w:val="333333"/>
-          <w:sz w:val="22"/>
-          <w:szCs w:val="22"/>
-        </w:rPr>
-        <w:t xml:space="preserve">Those are precisely the expensive and cheap reaches. Figure 3C plots apparent mass along each reach direction against the peak torque that reach requires: the correlation is 0.91, and the ranges nearly coincide — apparent mass varies 6.8-fold, peak torque 6.1-fold. Reaching along the needle means accelerating 2.09 kg of apparent mass; reaching across it means accelerating 0.30 kg. The task is the same and the limb is the same. Only the direction differs.</w:t>
+        <w:t xml:space="preserve">At the start posture Λ has eigenvalues of 0.30 kg and 2.09 kg, an anisotropy of 6.9, with the light axis pointing along 42° and the heavy axis along 132°. Figure 4A draws it. The ellipse is nearly a needle, and it is aimed almost exactly at the 135° and 315° targets while its narrow direction points at 45° and 225°.</w:t>
+      </w:r>
+    </w:p>
+    <w:p>
+      <w:pPr>
+        <w:spacing w:after="140" w:before="0" w:line="276"/>
+      </w:pPr>
+      <w:r>
+        <w:rPr>
+          <w:rFonts w:ascii="Cambria" w:cs="Cambria" w:eastAsia="Cambria" w:hAnsi="Cambria"/>
+          <w:color w:val="333333"/>
+          <w:sz w:val="22"/>
+          <w:szCs w:val="22"/>
+        </w:rPr>
+        <w:t xml:space="preserve">Those are precisely the expensive and cheap reaches. Figure 4C plots apparent mass along each reach direction against the peak torque that reach requires: the correlation is 0.91, and the ranges nearly coincide — apparent mass varies 6.8-fold, peak torque 6.1-fold. Reaching along the needle means accelerating 2.09 kg of apparent mass; reaching across it means accelerating 0.30 kg. The task is the same and the limb is the same. Only the direction differs.</w:t>
       </w:r>
     </w:p>
     <w:p>
@@ -1463,7 +1763,7 @@
           <w:sz w:val="22"/>
           <w:szCs w:val="22"/>
         </w:rPr>
-        <w:t xml:space="preserve">Across the eight directions, peak load torque varies only from 0.89 to 1.06 N·m — a factor of 1.2 — because all eight reaches begin from the same posture and none travels far. Peak inertial torque, as we saw, varies by 6.1. So the ratio between them swings from 0.58 at 135° to 3.56 at 45°, and that swing is almost entirely the inertial term’s doing. Figure 8B, in §7, plots all eight ratios.</w:t>
+        <w:t xml:space="preserve">Across the eight directions, peak load torque varies only from 0.89 to 1.06 N·m — a factor of 1.2 — because all eight reaches begin from the same posture and none travels far. Peak inertial torque, as we saw, varies by 6.1. So the ratio between them swings from 0.58 at 135° to 3.56 at 45°, and that swing is almost entirely the inertial term’s doing. Figure 9B, in §7, plots all eight ratios.</w:t>
       </w:r>
     </w:p>
     <w:p>
@@ -1568,7 +1868,7 @@
           <w:sz w:val="22"/>
           <w:szCs w:val="22"/>
         </w:rPr>
-        <w:t xml:space="preserve">where R is a 2 × 6 matrix of moment arms and F is the vector of muscle forces. Two equations, six unknowns. The system is underdetermined, and rank(R) = 2 means the set of solutions is four-dimensional.</w:t>
+        <w:t xml:space="preserve">where R is a 2 × 6 matrix of moment arms and F is the vector of muscle forces. Two equations, six unknowns. The system is underdetermined, and rank(R) = 2 means the set of solutions is four-dimensional. Figure 5A shows R for the six muscles.</w:t>
       </w:r>
     </w:p>
     <w:p>
@@ -1582,7 +1882,7 @@
           <wp:inline distT="0" distB="0" distL="0" distR="0">
             <wp:extent cx="5715000" cy="1847850"/>
             <wp:effectExtent t="0" r="0" b="0" l="0"/>
-            <wp:docPr id="1" name="" descr="" title=""/>
+            <wp:docPr id="5" name="" descr="" title=""/>
             <wp:cNvGraphicFramePr>
               <a:graphicFrameLocks xmlns:a="http://schemas.openxmlformats.org/drawingml/2006/main" noChangeAspect="1"/>
             </wp:cNvGraphicFramePr>
@@ -1632,7 +1932,7 @@
           <w:sz w:val="19"/>
           <w:szCs w:val="19"/>
         </w:rPr>
-        <w:t xml:space="preserve">Figure 4. </w:t>
+        <w:t xml:space="preserve">Figure 5. </w:t>
       </w:r>
       <w:r>
         <w:rPr>
@@ -1674,7 +1974,7 @@
           <w:sz w:val="22"/>
           <w:szCs w:val="22"/>
         </w:rPr>
-        <w:t xml:space="preserve">Four dimensions of freedom sounds like a great deal, and the standard statement of the redundancy problem stops there. But muscles pull; they do not push. The constraint F ≥ 0 is not a technicality, and Figure 4B shows what it costs.</w:t>
+        <w:t xml:space="preserve">Four dimensions of freedom sounds like a great deal, and the standard statement of the redundancy problem stops there. But muscles pull; they do not push. The constraint F ≥ 0 is not a technicality, and Figure 5B shows what it costs.</w:t>
       </w:r>
     </w:p>
     <w:p>
@@ -1747,7 +2047,7 @@
           <w:sz w:val="22"/>
           <w:szCs w:val="22"/>
         </w:rPr>
-        <w:t xml:space="preserve">Figure 5 makes this concrete at peak torque on the 135° reach. The three force patterns in Figure 5B produce the identical torque, and therefore the identical movement in Figure 5A. They differ only in how much co-contraction they carry. Figure 5C shows the price: as either pair grows, the torque stays fixed and the total muscle force climbs.</w:t>
+        <w:t xml:space="preserve">Figure 6 makes this concrete at peak torque on the 135° reach. The three force patterns in Figure 6B produce the identical torque, and therefore the identical movement in Figure 6A. They differ only in how much co-contraction they carry. Figure 6C shows the price: as either pair grows, the torque stays fixed and the total muscle force climbs.</w:t>
       </w:r>
     </w:p>
     <w:p>
@@ -1761,7 +2061,7 @@
           <wp:inline distT="0" distB="0" distL="0" distR="0">
             <wp:extent cx="5715000" cy="1619250"/>
             <wp:effectExtent t="0" r="0" b="0" l="0"/>
-            <wp:docPr id="1" name="" descr="" title=""/>
+            <wp:docPr id="6" name="" descr="" title=""/>
             <wp:cNvGraphicFramePr>
               <a:graphicFrameLocks xmlns:a="http://schemas.openxmlformats.org/drawingml/2006/main" noChangeAspect="1"/>
             </wp:cNvGraphicFramePr>
@@ -1811,7 +2111,7 @@
           <w:sz w:val="19"/>
           <w:szCs w:val="19"/>
         </w:rPr>
-        <w:t xml:space="preserve">Figure 5. </w:t>
+        <w:t xml:space="preserve">Figure 6. </w:t>
       </w:r>
       <w:r>
         <w:rPr>
@@ -3606,7 +3906,7 @@
           <w:sz w:val="22"/>
           <w:szCs w:val="22"/>
         </w:rPr>
-        <w:t xml:space="preserve">We are transplanting that criterion onto an 800-millisecond reach, solving it independently at every timestep with no coupling between instants. Whether a criterion validated on slow cyclic locomotion should govern a fast discrete movement is a fair question, and one worth pressing on Tuesday.</w:t>
+        <w:t xml:space="preserve">We are transplanting that criterion onto a 500-millisecond reach, solving it independently at every timestep with no coupling between instants. Whether a criterion validated on slow cyclic locomotion should govern a fast discrete movement is a fair question, and one worth pressing on Tuesday. Figure 7 shows what the criterion gives on the 135° reach.</w:t>
       </w:r>
     </w:p>
     <w:p>
@@ -3620,7 +3920,7 @@
           <wp:inline distT="0" distB="0" distL="0" distR="0">
             <wp:extent cx="5715000" cy="1504950"/>
             <wp:effectExtent t="0" r="0" b="0" l="0"/>
-            <wp:docPr id="1" name="" descr="" title=""/>
+            <wp:docPr id="7" name="" descr="" title=""/>
             <wp:cNvGraphicFramePr>
               <a:graphicFrameLocks xmlns:a="http://schemas.openxmlformats.org/drawingml/2006/main" noChangeAspect="1"/>
             </wp:cNvGraphicFramePr>
@@ -3670,7 +3970,7 @@
           <w:sz w:val="19"/>
           <w:szCs w:val="19"/>
         </w:rPr>
-        <w:t xml:space="preserve">Figure 6. </w:t>
+        <w:t xml:space="preserve">Figure 7. </w:t>
       </w:r>
       <w:r>
         <w:rPr>
@@ -3712,7 +4012,7 @@
           <w:sz w:val="22"/>
           <w:szCs w:val="22"/>
         </w:rPr>
-        <w:t xml:space="preserve">Raising n from 1 to 7 lowers peak muscle force from 29.5 N to 27.2 N while raising total force from 37.9 N to 39.4 N, and raises the participation ratio from 1.52 to 1.82. That is the endurance argument made quantitative: a higher exponent buys a lower peak by paying more in total.</w:t>
+        <w:t xml:space="preserve">Raising n from 1 to 7 lowers peak muscle force from 29.5 N to 27.2 N while raising total force from 37.9 N to 39.4 N (Figure 7B), and raises the participation ratio from 1.52 to 1.82 (Figure 7C). That is the endurance argument made quantitative: a higher exponent buys a lower peak by paying more in total.</w:t>
       </w:r>
     </w:p>
     <w:p>
@@ -3771,7 +4071,7 @@
           <w:sz w:val="22"/>
           <w:szCs w:val="22"/>
         </w:rPr>
-        <w:t xml:space="preserve">Figure 6A shows pec carrying the movement for the first half and delt taking over for the second, with a rapid changeover around 258 ms. This is not a numerical artifact and it is not a discontinuity — at fine time resolution the forces are continuous, with the outgoing muscle’s force falling to zero as the incoming one rises.</w:t>
+        <w:t xml:space="preserve">Figure 7A shows pec carrying the movement for the first half and delt taking over for the second, with a rapid changeover around 258 ms. This is not a numerical artifact and it is not a discontinuity — at fine time resolution the forces are continuous, with the outgoing muscle’s force falling to zero as the incoming one rises.</w:t>
       </w:r>
     </w:p>
     <w:p>
@@ -4689,7 +4989,7 @@
           <w:sz w:val="22"/>
           <w:szCs w:val="22"/>
         </w:rPr>
-        <w:t xml:space="preserve">With c = 0.112 mm⁻¹ the recruitment gradient, the product cG = 2.24, which is the number Week 2 chose so that full activation produces about 125 N in the pectoralis. The chain is now closed: a desired hand path at one end, a neural command at the other, and the same plant in between.</w:t>
+        <w:t xml:space="preserve">With c = 0.112 mm⁻¹ the recruitment gradient, the product cG = 2.24, which is the number Week 2 chose so that full activation produces about 125 N in the pectoralis. The chain is now closed: a desired hand path at one end, a neural command at the other, and the same plant in between. Figure 8 shows the force–length relation being inverted (A), the activation it gives through the 135° reach (B), and the peak activation in each direction (C).</w:t>
       </w:r>
     </w:p>
     <w:p>
@@ -4703,7 +5003,7 @@
           <wp:inline distT="0" distB="0" distL="0" distR="0">
             <wp:extent cx="5715000" cy="1552575"/>
             <wp:effectExtent t="0" r="0" b="0" l="0"/>
-            <wp:docPr id="1" name="" descr="" title=""/>
+            <wp:docPr id="8" name="" descr="" title=""/>
             <wp:cNvGraphicFramePr>
               <a:graphicFrameLocks xmlns:a="http://schemas.openxmlformats.org/drawingml/2006/main" noChangeAspect="1"/>
             </wp:cNvGraphicFramePr>
@@ -4753,7 +5053,7 @@
           <w:sz w:val="19"/>
           <w:szCs w:val="19"/>
         </w:rPr>
-        <w:t xml:space="preserve">Figure 7. </w:t>
+        <w:t xml:space="preserve">Figure 8. </w:t>
       </w:r>
       <w:r>
         <w:rPr>
@@ -4809,7 +5109,7 @@
           <w:sz w:val="22"/>
           <w:szCs w:val="22"/>
         </w:rPr>
-        <w:t xml:space="preserve">Our task passes, though with less margin than the torques alone would suggest. The largest activation anywhere in the eight reaches is 0.81, at 135° — the direction §2 identified as the most demanding, which is the consistency check you would want. The 45° reach needs only 0.29. Figure 7C shows the full set.</w:t>
+        <w:t xml:space="preserve">Our task passes, though with less margin than the torques alone would suggest. The largest activation anywhere in the eight reaches is 0.81, at 135° — the direction §2 identified as the most demanding, which is the consistency check you would want. The 45° reach needs only 0.29. Figure 8C shows the full set.</w:t>
       </w:r>
     </w:p>
     <w:p>
@@ -4929,7 +5229,7 @@
           <w:sz w:val="22"/>
           <w:szCs w:val="22"/>
         </w:rPr>
-        <w:t xml:space="preserve">Figure 8A compares the optimal forces with and without the load at t = 400 ms, the instant of peak torque on this reach. The load changes the required torque from (−1.51, −0.17) N·m to (−1.98, −1.00) N·m. The shoulder demand grows by about a third. The elbow demand grows about sixfold, because the load falls mainly on the elbow: −0.83 N·m there, against −0.46 N·m at the shoulder.</w:t>
+        <w:t xml:space="preserve">Figure 9A compares the optimal forces with and without the load at t = 400 ms, the instant of peak torque on this reach. The load changes the required torque from (−1.51, −0.17) N·m to (−1.98, −1.00) N·m. The shoulder demand grows by about a third. The elbow demand grows about sixfold, because the load falls mainly on the elbow: −0.83 N·m there, against −0.46 N·m at the shoulder.</w:t>
       </w:r>
     </w:p>
     <w:p>
@@ -4943,7 +5243,7 @@
           <wp:inline distT="0" distB="0" distL="0" distR="0">
             <wp:extent cx="5715000" cy="1504950"/>
             <wp:effectExtent t="0" r="0" b="0" l="0"/>
-            <wp:docPr id="1" name="" descr="" title=""/>
+            <wp:docPr id="9" name="" descr="" title=""/>
             <wp:cNvGraphicFramePr>
               <a:graphicFrameLocks xmlns:a="http://schemas.openxmlformats.org/drawingml/2006/main" noChangeAspect="1"/>
             </wp:cNvGraphicFramePr>
@@ -4993,7 +5293,7 @@
           <w:sz w:val="19"/>
           <w:szCs w:val="19"/>
         </w:rPr>
-        <w:t xml:space="preserve">Figure 8. </w:t>
+        <w:t xml:space="preserve">Figure 9. </w:t>
       </w:r>
       <w:r>
         <w:rPr>
@@ -5046,35 +5346,35 @@
           <w:sz w:val="22"/>
           <w:szCs w:val="22"/>
         </w:rPr>
-        <w:t xml:space="preserve">Figure 8B puts this reach in context. For each direction it divides the largest load torque at either joint by the largest inertial torque at either joint. The 135° reach has the lowest ratio of the eight, 0.58, because it is the most inertia-dominated reach (§2). So the load reorganizes recruitment even where it is the smaller of the two demands. In three directions, 45°, 225° and 270°, the load is the larger demand.</w:t>
-      </w:r>
-    </w:p>
-    <w:p>
-      <w:pPr>
-        <w:spacing w:after="140" w:before="0" w:line="276"/>
-      </w:pPr>
-      <w:r>
-        <w:rPr>
-          <w:rFonts w:ascii="Cambria" w:cs="Cambria" w:eastAsia="Cambria" w:hAnsi="Cambria"/>
-          <w:color w:val="333333"/>
-          <w:sz w:val="22"/>
-          <w:szCs w:val="22"/>
-        </w:rPr>
-        <w:t xml:space="preserve">Figure 8C follows the forces through the whole loaded reach. Throughout, tri_l stays between 29 and 33 N, because the load acts the whole time; its force holds the hand rather than moving it. The movement pattern of §5.3 rides on top. In the first half pec accelerates the shoulder (peak 34.6 N at 106 ms); in the second, delt brakes it (peak 32.6 N at 401 ms). The changeover comes at 265 ms, against 258 ms without the load.</w:t>
-      </w:r>
-    </w:p>
-    <w:p>
-      <w:pPr>
-        <w:spacing w:after="140" w:before="0" w:line="276"/>
-      </w:pPr>
-      <w:r>
-        <w:rPr>
-          <w:rFonts w:ascii="Cambria" w:cs="Cambria" w:eastAsia="Cambria" w:hAnsi="Cambria"/>
-          <w:color w:val="333333"/>
-          <w:sz w:val="22"/>
-          <w:szCs w:val="22"/>
-        </w:rPr>
-        <w:t xml:space="preserve">One detail in Figure 8C needs explaining. At t = 0, before the hand moves, pec already carries 6 N. Holding the load needs elbow extension, and the cubic cost prefers to share it between tri_l and tri_lg rather than load tri_l alone. But tri_lg also extends the shoulder, by more than the load requires there, and pec cancels the excess. The result is 0.24 N·m of shoulder co-contraction, which the optimizer accepts because it lowers the total cost. Adding a pure co-contraction pair always raises the cost (§4.2); co-contraction that comes with a muscle crossing two joints can lower it.</w:t>
+        <w:t xml:space="preserve">Figure 9B puts this reach in context. For each direction it divides the largest load torque at either joint by the largest inertial torque at either joint. The 135° reach has the lowest ratio of the eight, 0.58, because it is the most inertia-dominated reach (§2). So the load reorganizes recruitment even where it is the smaller of the two demands. In three directions, 45°, 225° and 270°, the load is the larger demand.</w:t>
+      </w:r>
+    </w:p>
+    <w:p>
+      <w:pPr>
+        <w:spacing w:after="140" w:before="0" w:line="276"/>
+      </w:pPr>
+      <w:r>
+        <w:rPr>
+          <w:rFonts w:ascii="Cambria" w:cs="Cambria" w:eastAsia="Cambria" w:hAnsi="Cambria"/>
+          <w:color w:val="333333"/>
+          <w:sz w:val="22"/>
+          <w:szCs w:val="22"/>
+        </w:rPr>
+        <w:t xml:space="preserve">Figure 9C follows the forces through the whole loaded reach. Throughout, tri_l stays between 29 and 33 N, because the load acts the whole time; its force holds the hand rather than moving it. The movement pattern of §5.3 rides on top. In the first half pec accelerates the shoulder (peak 34.6 N at 106 ms); in the second, delt brakes it (peak 32.6 N at 401 ms). The changeover comes at 265 ms, against 258 ms without the load.</w:t>
+      </w:r>
+    </w:p>
+    <w:p>
+      <w:pPr>
+        <w:spacing w:after="140" w:before="0" w:line="276"/>
+      </w:pPr>
+      <w:r>
+        <w:rPr>
+          <w:rFonts w:ascii="Cambria" w:cs="Cambria" w:eastAsia="Cambria" w:hAnsi="Cambria"/>
+          <w:color w:val="333333"/>
+          <w:sz w:val="22"/>
+          <w:szCs w:val="22"/>
+        </w:rPr>
+        <w:t xml:space="preserve">One detail in Figure 9C needs explaining. At t = 0, before the hand moves, pec already carries 6 N. Holding the load needs elbow extension, and the cubic cost prefers to share it between tri_l and tri_lg rather than load tri_l alone. But tri_lg also extends the shoulder, by more than the load requires there, and pec cancels the excess. The result is 0.24 N·m of shoulder co-contraction, which the optimizer accepts because it lowers the total cost. Adding a pure co-contraction pair always raises the cost (§4.2); co-contraction that comes with a muscle crossing two joints can lower it.</w:t>
       </w:r>
     </w:p>
     <w:p>
@@ -5208,7 +5508,7 @@
           <w:sz w:val="22"/>
           <w:szCs w:val="22"/>
         </w:rPr>
-        <w:t xml:space="preserve">Getting it right, however, depends on a choice that is easy to make without noticing. The six muscles produce very different absolute forces — deltoid peaks near 30 N, biceps short barely reaches 1 N — so the curves have to be put on a common scale before they can be compared at all. The natural way to do that is to divide each muscle by its own largest value across the eight directions. That is what Figure 9A does, and it gives the wrong answer.</w:t>
+        <w:t xml:space="preserve">Getting it right, however, depends on a choice that is easy to make without noticing. The six muscles produce very different absolute forces — deltoid peaks near 30 N, biceps short barely reaches 1 N — so the curves have to be put on a common scale before they can be compared at all. The natural way to do that is to divide each muscle by its own largest value across the eight directions. That is what Figure 10A does, and it gives the wrong answer.</w:t>
       </w:r>
     </w:p>
     <w:p>
@@ -5222,7 +5522,7 @@
           <wp:inline distT="0" distB="0" distL="0" distR="0">
             <wp:extent cx="5715000" cy="1714500"/>
             <wp:effectExtent t="0" r="0" b="0" l="0"/>
-            <wp:docPr id="1" name="" descr="" title=""/>
+            <wp:docPr id="10" name="" descr="" title=""/>
             <wp:cNvGraphicFramePr>
               <a:graphicFrameLocks xmlns:a="http://schemas.openxmlformats.org/drawingml/2006/main" noChangeAspect="1"/>
             </wp:cNvGraphicFramePr>
@@ -5272,7 +5572,7 @@
           <w:sz w:val="19"/>
           <w:szCs w:val="19"/>
         </w:rPr>
-        <w:t xml:space="preserve">Figure 9. </w:t>
+        <w:t xml:space="preserve">Figure 10. </w:t>
       </w:r>
       <w:r>
         <w:rPr>
@@ -5314,7 +5614,7 @@
           <w:sz w:val="22"/>
           <w:szCs w:val="22"/>
         </w:rPr>
-        <w:t xml:space="preserve">Dividing each muscle by its own maximum seems natural and produces Figure 9A. But §2 established that peak torque varies 6.1-fold across directions and is largest at 135°, so any muscle that is recruited at all will show its largest force there. The correlation between the mean normalized force and the torque magnitude is 0.86. What the panel is mostly displaying is which reach is hardest.</w:t>
+        <w:t xml:space="preserve">Dividing each muscle by its own maximum seems natural and produces Figure 10A. But §2 established that peak torque varies 6.1-fold across directions and is largest at 135°, so any muscle that is recruited at all will show its largest force there. The correlation between the mean normalized force and the torque magnitude is 0.86. What the panel is mostly displaying is which reach is hardest.</w:t>
       </w:r>
     </w:p>
     <w:p>
@@ -5356,7 +5656,7 @@
           <w:sz w:val="22"/>
           <w:szCs w:val="22"/>
         </w:rPr>
-        <w:t xml:space="preserve">There is a sharper check available, and it does not require the correlation. Look up pec and delt in the moment arm matrix of Figure 4: their shoulder moment arms are +4.0 cm and −4.0 cm. They are antagonists, pulling the shoulder in opposite directions. Two muscles that oppose each other cannot both be maximally recruited for the same reach, so if they share a preferred direction the analysis has gone wrong somewhere. In panel A both are brightest at 135°, along with bic_s and tri_lg — four of six muscles agreeing on one direction, which no arrangement of moment arms could produce.</w:t>
+        <w:t xml:space="preserve">There is a sharper check available, and it does not require the correlation. Look up pec and delt in the moment arm matrix of Figure 5: their shoulder moment arms are +4.0 cm and −4.0 cm. They are antagonists, pulling the shoulder in opposite directions. Two muscles that oppose each other cannot both be maximally recruited for the same reach, so if they share a preferred direction the analysis has gone wrong somewhere. In panel A both are brightest at 135°, along with bic_s and tri_lg — four of six muscles agreeing on one direction, which no arrangement of moment arms could produce.</w:t>
       </w:r>
     </w:p>
     <w:p>

</xml_diff>